<commit_message>
Koncept práce vol. 4
</commit_message>
<xml_diff>
--- a/Koncept Dizertačnej Práce.docx
+++ b/Koncept Dizertačnej Práce.docx
@@ -533,7 +533,7 @@
           <w:sz w:val="24"/>
           <w:szCs w:val="24"/>
         </w:rPr>
-        <w:t xml:space="preserve"> (2016-2021) výrazne zvýšil</w:t>
+        <w:t xml:space="preserve"> výrazne zvýšil</w:t>
       </w:r>
       <w:r>
         <w:rPr>
@@ -993,16 +993,16 @@
           <w:sz w:val="24"/>
           <w:szCs w:val="24"/>
         </w:rPr>
-        <w:t>dôrazom na globálne trhy a vplyv geopolitických šokov s použitím robustných metód umelej inteligencie a strojového učenia. Presne t</w:t>
-      </w:r>
-      <w:r>
-        <w:rPr>
-          <w:rFonts w:ascii="Calibri" w:hAnsi="Calibri" w:cs="Calibri"/>
-          <w:color w:val="000000"/>
-          <w:sz w:val="24"/>
-          <w:szCs w:val="24"/>
-        </w:rPr>
-        <w:t>ieto</w:t>
+        <w:t xml:space="preserve">dôrazom na globálne trhy a vplyv geopolitických šokov s použitím robustných metód umelej inteligencie a strojového učenia. </w:t>
+      </w:r>
+      <w:r>
+        <w:rPr>
+          <w:rFonts w:ascii="Calibri" w:hAnsi="Calibri" w:cs="Calibri"/>
+          <w:color w:val="000000"/>
+          <w:sz w:val="24"/>
+          <w:szCs w:val="24"/>
+        </w:rPr>
+        <w:t>Na spomínané</w:t>
       </w:r>
       <w:r>
         <w:rPr>
@@ -1029,7 +1029,16 @@
           <w:sz w:val="24"/>
           <w:szCs w:val="24"/>
         </w:rPr>
-        <w:t xml:space="preserve"> má za cieľ vyriešiť táto dizertačná práca.</w:t>
+        <w:t xml:space="preserve"> sa zameriava</w:t>
+      </w:r>
+      <w:r>
+        <w:rPr>
+          <w:rFonts w:ascii="Calibri" w:hAnsi="Calibri" w:cs="Calibri"/>
+          <w:color w:val="000000"/>
+          <w:sz w:val="24"/>
+          <w:szCs w:val="24"/>
+        </w:rPr>
+        <w:t xml:space="preserve"> táto dizertačná práca.</w:t>
       </w:r>
     </w:p>
     <w:p>
@@ -1100,47 +1109,6 @@
     </w:p>
     <w:p>
       <w:pPr>
-        <w:ind w:firstLine="708"/>
-        <w:jc w:val="both"/>
-        <w:rPr>
-          <w:rFonts w:ascii="Calibri" w:hAnsi="Calibri" w:cs="Calibri"/>
-          <w:color w:val="000000"/>
-          <w:sz w:val="24"/>
-          <w:szCs w:val="24"/>
-        </w:rPr>
-      </w:pPr>
-      <w:r>
-        <w:rPr>
-          <w:rFonts w:ascii="Calibri" w:hAnsi="Calibri" w:cs="Calibri"/>
-          <w:color w:val="000000"/>
-          <w:sz w:val="24"/>
-          <w:szCs w:val="24"/>
-        </w:rPr>
-        <w:t xml:space="preserve">Analýza bude založená na časových radoch trhových cien akcií, ktoré budú predspracované pomocou metód čistenia dát, transformácie časových radov a odstránenia </w:t>
-      </w:r>
-      <w:proofErr w:type="spellStart"/>
-      <w:r>
-        <w:rPr>
-          <w:rFonts w:ascii="Calibri" w:hAnsi="Calibri" w:cs="Calibri"/>
-          <w:color w:val="000000"/>
-          <w:sz w:val="24"/>
-          <w:szCs w:val="24"/>
-        </w:rPr>
-        <w:t>autokorelácie</w:t>
-      </w:r>
-      <w:proofErr w:type="spellEnd"/>
-      <w:r>
-        <w:rPr>
-          <w:rFonts w:ascii="Calibri" w:hAnsi="Calibri" w:cs="Calibri"/>
-          <w:color w:val="000000"/>
-          <w:sz w:val="24"/>
-          <w:szCs w:val="24"/>
-        </w:rPr>
-        <w:t>. Na takto pripravené dáta budú aplikované metódy umelej inteligencie a strojového učenia zamerané na identifikáciu vzorov, klasifikáciu a predikciu volatility.</w:t>
-      </w:r>
-    </w:p>
-    <w:p>
-      <w:pPr>
         <w:jc w:val="both"/>
         <w:rPr>
           <w:rFonts w:ascii="Calibri" w:hAnsi="Calibri" w:cs="Calibri"/>
@@ -1149,6 +1117,7 @@
           <w:color w:val="000000"/>
           <w:sz w:val="28"/>
           <w:szCs w:val="28"/>
+          <w:u w:val="thick"/>
         </w:rPr>
       </w:pPr>
       <w:r>
@@ -1157,8 +1126,9 @@
           <w:b/>
           <w:bCs/>
           <w:color w:val="000000"/>
-          <w:sz w:val="28"/>
-          <w:szCs w:val="28"/>
+          <w:sz w:val="24"/>
+          <w:szCs w:val="24"/>
+          <w:u w:val="thick"/>
         </w:rPr>
         <w:t>Poznatky, ktoré rozšíri dizertačná práca</w:t>
       </w:r>
@@ -1240,7 +1210,58 @@
           <w:sz w:val="24"/>
           <w:szCs w:val="24"/>
         </w:rPr>
-        <w:t xml:space="preserve"> analyzovali skutočnú volatilitu desiatich globálnych akciových indexov, pričom porovnávali lineárne a nelineárne modely strojového učenia</w:t>
+        <w:t xml:space="preserve"> analyzovali skutočnú volatilitu</w:t>
+      </w:r>
+      <w:r>
+        <w:rPr>
+          <w:rFonts w:ascii="Calibri" w:hAnsi="Calibri" w:cs="Calibri"/>
+          <w:color w:val="000000"/>
+          <w:sz w:val="24"/>
+          <w:szCs w:val="24"/>
+        </w:rPr>
+        <w:t xml:space="preserve"> (</w:t>
+      </w:r>
+      <w:proofErr w:type="spellStart"/>
+      <w:r>
+        <w:rPr>
+          <w:rFonts w:ascii="Calibri" w:hAnsi="Calibri" w:cs="Calibri"/>
+          <w:i/>
+          <w:iCs/>
+          <w:color w:val="000000"/>
+          <w:sz w:val="24"/>
+          <w:szCs w:val="24"/>
+        </w:rPr>
+        <w:t>Realized</w:t>
+      </w:r>
+      <w:proofErr w:type="spellEnd"/>
+      <w:r>
+        <w:rPr>
+          <w:rFonts w:ascii="Calibri" w:hAnsi="Calibri" w:cs="Calibri"/>
+          <w:i/>
+          <w:iCs/>
+          <w:color w:val="000000"/>
+          <w:sz w:val="24"/>
+          <w:szCs w:val="24"/>
+        </w:rPr>
+        <w:t xml:space="preserve"> Volatility</w:t>
+      </w:r>
+      <w:r>
+        <w:rPr>
+          <w:rFonts w:ascii="Calibri" w:hAnsi="Calibri" w:cs="Calibri"/>
+          <w:color w:val="000000"/>
+          <w:sz w:val="24"/>
+          <w:szCs w:val="24"/>
+        </w:rPr>
+        <w:t>)</w:t>
+      </w:r>
+      <w:r>
+        <w:rPr>
+          <w:rFonts w:ascii="Calibri" w:hAnsi="Calibri" w:cs="Calibri"/>
+          <w:color w:val="000000"/>
+          <w:sz w:val="24"/>
+          <w:szCs w:val="24"/>
+        </w:rPr>
+        <w:t xml:space="preserve"> desiatich globálnych akciových indexov, pričom porovnávali lineárne a nelineárne modely strojového učenia</w:t>
       </w:r>
       <w:r>
         <w:rPr>
@@ -1277,6 +1298,15 @@
           <w:szCs w:val="24"/>
         </w:rPr>
         <w:t xml:space="preserve">. </w:t>
+      </w:r>
+      <w:r>
+        <w:rPr>
+          <w:rFonts w:ascii="Calibri" w:hAnsi="Calibri" w:cs="Calibri"/>
+          <w:color w:val="000000"/>
+          <w:sz w:val="24"/>
+          <w:szCs w:val="24"/>
+        </w:rPr>
+        <w:t>Zároveň práca rozšíri poznatky o výkonnosti metód umelej inteligencie v porovnaní s ekonometrickými modelmi.</w:t>
       </w:r>
     </w:p>
     <w:p>
@@ -1287,8 +1317,9 @@
           <w:b/>
           <w:bCs/>
           <w:color w:val="000000"/>
-          <w:sz w:val="28"/>
-          <w:szCs w:val="28"/>
+          <w:sz w:val="24"/>
+          <w:szCs w:val="24"/>
+          <w:u w:val="thick"/>
         </w:rPr>
       </w:pPr>
       <w:r>
@@ -1297,8 +1328,9 @@
           <w:b/>
           <w:bCs/>
           <w:color w:val="000000"/>
-          <w:sz w:val="28"/>
-          <w:szCs w:val="28"/>
+          <w:sz w:val="24"/>
+          <w:szCs w:val="24"/>
+          <w:u w:val="thick"/>
         </w:rPr>
         <w:t>Poznatky, ktoré prinesie dizertačná práca</w:t>
       </w:r>
@@ -1329,43 +1361,34 @@
           <w:sz w:val="24"/>
           <w:szCs w:val="24"/>
         </w:rPr>
-        <w:t>Komparácia bude zahŕňať nielen volatilitu trhov, ale aj</w:t>
-      </w:r>
-      <w:r>
-        <w:rPr>
-          <w:rFonts w:ascii="Calibri" w:hAnsi="Calibri" w:cs="Calibri"/>
-          <w:color w:val="000000"/>
-          <w:sz w:val="24"/>
-          <w:szCs w:val="24"/>
-        </w:rPr>
-        <w:t xml:space="preserve"> porovnanie</w:t>
-      </w:r>
-      <w:r>
-        <w:rPr>
-          <w:rFonts w:ascii="Calibri" w:hAnsi="Calibri" w:cs="Calibri"/>
-          <w:color w:val="000000"/>
-          <w:sz w:val="24"/>
-          <w:szCs w:val="24"/>
-        </w:rPr>
-        <w:t xml:space="preserve"> výkon</w:t>
-      </w:r>
-      <w:r>
-        <w:rPr>
-          <w:rFonts w:ascii="Calibri" w:hAnsi="Calibri" w:cs="Calibri"/>
-          <w:color w:val="000000"/>
-          <w:sz w:val="24"/>
-          <w:szCs w:val="24"/>
-        </w:rPr>
-        <w:t>u</w:t>
-      </w:r>
-      <w:r>
-        <w:rPr>
-          <w:rFonts w:ascii="Calibri" w:hAnsi="Calibri" w:cs="Calibri"/>
-          <w:color w:val="000000"/>
-          <w:sz w:val="24"/>
-          <w:szCs w:val="24"/>
-        </w:rPr>
-        <w:t xml:space="preserve"> modelov strojového učenia s ekonometrickými metódami, pretože z </w:t>
+        <w:t>Výskum práce prinesie poznatky ohľadom výkonnosti metód umelej inteligencie aplikované na komparáciu volatility trhov USA, Európy a Číny</w:t>
+      </w:r>
+      <w:r>
+        <w:rPr>
+          <w:rFonts w:ascii="Calibri" w:hAnsi="Calibri" w:cs="Calibri"/>
+          <w:color w:val="000000"/>
+          <w:sz w:val="24"/>
+          <w:szCs w:val="24"/>
+        </w:rPr>
+        <w:t xml:space="preserve">, </w:t>
+      </w:r>
+      <w:r>
+        <w:rPr>
+          <w:rFonts w:ascii="Calibri" w:hAnsi="Calibri" w:cs="Calibri"/>
+          <w:color w:val="000000"/>
+          <w:sz w:val="24"/>
+          <w:szCs w:val="24"/>
+        </w:rPr>
+        <w:t>keďže</w:t>
+      </w:r>
+      <w:r>
+        <w:rPr>
+          <w:rFonts w:ascii="Calibri" w:hAnsi="Calibri" w:cs="Calibri"/>
+          <w:color w:val="000000"/>
+          <w:sz w:val="24"/>
+          <w:szCs w:val="24"/>
+        </w:rPr>
+        <w:t xml:space="preserve"> z </w:t>
       </w:r>
       <w:r>
         <w:rPr>
@@ -1401,16 +1424,7 @@
           <w:sz w:val="24"/>
           <w:szCs w:val="24"/>
         </w:rPr>
-        <w:t xml:space="preserve">ktorý prístup </w:t>
-      </w:r>
-      <w:r>
-        <w:rPr>
-          <w:rFonts w:ascii="Calibri" w:hAnsi="Calibri" w:cs="Calibri"/>
-          <w:color w:val="000000"/>
-          <w:sz w:val="24"/>
-          <w:szCs w:val="24"/>
-        </w:rPr>
-        <w:t>má lepšie výsledky</w:t>
+        <w:t>či majú tieto metódy jednoznačne lepšie výsledky ako ekonometrické modely</w:t>
       </w:r>
       <w:r>
         <w:rPr>
@@ -1428,16 +1442,7 @@
           <w:sz w:val="24"/>
           <w:szCs w:val="24"/>
         </w:rPr>
-        <w:t>Okrem iného bude prínosom práce aj komparatívna analýza vzorov identifikovaných z časových radov, pričom bude sústredená na interpretáciu reakcií trhov na geopolitické šoky.</w:t>
-      </w:r>
-      <w:r>
-        <w:rPr>
-          <w:rFonts w:ascii="Calibri" w:hAnsi="Calibri" w:cs="Calibri"/>
-          <w:color w:val="000000"/>
-          <w:sz w:val="24"/>
-          <w:szCs w:val="24"/>
-        </w:rPr>
-        <w:t xml:space="preserve"> Výsledkom bude identifikácia vzorov volatility, ktoré dokážu určiť, ako akciové trhy reagovali na obdobie </w:t>
+        <w:t xml:space="preserve">Okrem iného bude prínosom práce aj komparatívna analýza vzorov identifikovaných z časových radov, pričom bude sústredená na interpretáciu reakcií trhov na geopolitické šoky. Výsledkom bude identifikácia vzorov volatility, ktoré dokážu určiť, ako akciové trhy reagovali na obdobie </w:t>
       </w:r>
       <w:r>
         <w:rPr>
@@ -1468,8 +1473,9 @@
           <w:b/>
           <w:bCs/>
           <w:color w:val="000000"/>
-          <w:sz w:val="28"/>
-          <w:szCs w:val="28"/>
+          <w:sz w:val="24"/>
+          <w:szCs w:val="24"/>
+          <w:u w:val="thick"/>
         </w:rPr>
       </w:pPr>
       <w:r>
@@ -1478,8 +1484,9 @@
           <w:b/>
           <w:bCs/>
           <w:color w:val="000000"/>
-          <w:sz w:val="28"/>
-          <w:szCs w:val="28"/>
+          <w:sz w:val="24"/>
+          <w:szCs w:val="24"/>
+          <w:u w:val="thick"/>
         </w:rPr>
         <w:t>Predpokladané praktické výsledky</w:t>
       </w:r>
@@ -1508,7 +1515,61 @@
           <w:sz w:val="24"/>
           <w:szCs w:val="24"/>
         </w:rPr>
-        <w:t>Výsledkom výskumu dizertačnej práce bude samotný návrh metodológie, ako aj spracovanie časových radov, výpočet volatility, identifikáciu vzorov a porovnanie modelov volatility na akciových trhoch USA, Európy a Číny. Výstupom bude taktiež spomínané empirické porovnanie ekonometrických modelov, ako aj modelov strojového učenia. Práca taktiež poskytne praktické poznatky o obdobiach so zvýšeným rizikom (</w:t>
+        <w:t>Výsledkom výskumu dizertačnej práce bude samotný návrh metodológie, ako aj spracovanie časových radov, výpočet volatility, identifikáci</w:t>
+      </w:r>
+      <w:r>
+        <w:rPr>
+          <w:rFonts w:ascii="Calibri" w:hAnsi="Calibri" w:cs="Calibri"/>
+          <w:color w:val="000000"/>
+          <w:sz w:val="24"/>
+          <w:szCs w:val="24"/>
+        </w:rPr>
+        <w:t>a</w:t>
+      </w:r>
+      <w:r>
+        <w:rPr>
+          <w:rFonts w:ascii="Calibri" w:hAnsi="Calibri" w:cs="Calibri"/>
+          <w:color w:val="000000"/>
+          <w:sz w:val="24"/>
+          <w:szCs w:val="24"/>
+        </w:rPr>
+        <w:t xml:space="preserve"> vzorov a porovnanie modelov volatility na akciových trhoch USA, Európy a Číny. Výstupom bude taktiež spomínané empirické porovnanie ekonometrických modelov, ako aj modelov strojového učenia. Práca taktiež poskytne praktické poznatky o</w:t>
+      </w:r>
+      <w:r>
+        <w:rPr>
+          <w:rFonts w:ascii="Calibri" w:hAnsi="Calibri" w:cs="Calibri"/>
+          <w:color w:val="000000"/>
+          <w:sz w:val="24"/>
+          <w:szCs w:val="24"/>
+        </w:rPr>
+        <w:t xml:space="preserve"> rizikových </w:t>
+      </w:r>
+      <w:r>
+        <w:rPr>
+          <w:rFonts w:ascii="Calibri" w:hAnsi="Calibri" w:cs="Calibri"/>
+          <w:color w:val="000000"/>
+          <w:sz w:val="24"/>
+          <w:szCs w:val="24"/>
+        </w:rPr>
+        <w:t>obdobiach</w:t>
+      </w:r>
+      <w:r>
+        <w:rPr>
+          <w:rFonts w:ascii="Calibri" w:hAnsi="Calibri" w:cs="Calibri"/>
+          <w:color w:val="000000"/>
+          <w:sz w:val="24"/>
+          <w:szCs w:val="24"/>
+        </w:rPr>
+        <w:t xml:space="preserve"> </w:t>
+      </w:r>
+      <w:r>
+        <w:rPr>
+          <w:rFonts w:ascii="Calibri" w:hAnsi="Calibri" w:cs="Calibri"/>
+          <w:color w:val="000000"/>
+          <w:sz w:val="24"/>
+          <w:szCs w:val="24"/>
+        </w:rPr>
+        <w:t>(</w:t>
       </w:r>
       <w:r>
         <w:rPr>
@@ -1529,6 +1590,15 @@
           <w:szCs w:val="24"/>
         </w:rPr>
         <w:t>) a o faktoroch, ktoré vplývajú na dynamiku volatility.</w:t>
+      </w:r>
+      <w:r>
+        <w:rPr>
+          <w:rFonts w:ascii="Calibri" w:hAnsi="Calibri" w:cs="Calibri"/>
+          <w:color w:val="000000"/>
+          <w:sz w:val="24"/>
+          <w:szCs w:val="24"/>
+        </w:rPr>
+        <w:t xml:space="preserve"> Výsledky taktiež poukážu na robustnosť navrhovanej metodiky cez porovnanie rozdielnych zdrojov dát časových radov.</w:t>
       </w:r>
     </w:p>
     <w:p>
@@ -1537,10 +1607,21 @@
         <w:rPr>
           <w:b/>
           <w:bCs/>
-          <w:sz w:val="28"/>
-          <w:szCs w:val="28"/>
+          <w:sz w:val="24"/>
+          <w:szCs w:val="24"/>
+          <w:u w:val="thick"/>
         </w:rPr>
       </w:pPr>
+      <w:r>
+        <w:rPr>
+          <w:b/>
+          <w:bCs/>
+          <w:sz w:val="24"/>
+          <w:szCs w:val="24"/>
+          <w:u w:val="thick"/>
+        </w:rPr>
+        <w:t>Vyplývajúce Hypotézy</w:t>
+      </w:r>
     </w:p>
     <w:p>
       <w:pPr>
@@ -1548,10 +1629,136 @@
         <w:rPr>
           <w:b/>
           <w:bCs/>
-          <w:sz w:val="28"/>
-          <w:szCs w:val="28"/>
+          <w:sz w:val="24"/>
+          <w:szCs w:val="24"/>
         </w:rPr>
       </w:pPr>
+      <w:r>
+        <w:rPr>
+          <w:b/>
+          <w:bCs/>
+          <w:sz w:val="24"/>
+          <w:szCs w:val="24"/>
+        </w:rPr>
+        <w:t>H1: Obdobie pandémie COVID-19</w:t>
+      </w:r>
+      <w:r>
+        <w:rPr>
+          <w:b/>
+          <w:bCs/>
+          <w:sz w:val="24"/>
+          <w:szCs w:val="24"/>
+        </w:rPr>
+        <w:t xml:space="preserve"> viedlo k</w:t>
+      </w:r>
+      <w:r>
+        <w:rPr>
+          <w:b/>
+          <w:bCs/>
+          <w:sz w:val="24"/>
+          <w:szCs w:val="24"/>
+        </w:rPr>
+        <w:t xml:space="preserve"> štatisticky význam</w:t>
+      </w:r>
+      <w:r>
+        <w:rPr>
+          <w:b/>
+          <w:bCs/>
+          <w:sz w:val="24"/>
+          <w:szCs w:val="24"/>
+        </w:rPr>
+        <w:t>nému</w:t>
+      </w:r>
+      <w:r>
+        <w:rPr>
+          <w:b/>
+          <w:bCs/>
+          <w:sz w:val="24"/>
+          <w:szCs w:val="24"/>
+        </w:rPr>
+        <w:t xml:space="preserve"> zvýš</w:t>
+      </w:r>
+      <w:r>
+        <w:rPr>
+          <w:b/>
+          <w:bCs/>
+          <w:sz w:val="24"/>
+          <w:szCs w:val="24"/>
+        </w:rPr>
+        <w:t>eniu</w:t>
+      </w:r>
+      <w:r>
+        <w:rPr>
+          <w:b/>
+          <w:bCs/>
+          <w:sz w:val="24"/>
+          <w:szCs w:val="24"/>
+        </w:rPr>
+        <w:t xml:space="preserve"> volatilit</w:t>
+      </w:r>
+      <w:r>
+        <w:rPr>
+          <w:b/>
+          <w:bCs/>
+          <w:sz w:val="24"/>
+          <w:szCs w:val="24"/>
+        </w:rPr>
+        <w:t>y</w:t>
+      </w:r>
+      <w:r>
+        <w:rPr>
+          <w:b/>
+          <w:bCs/>
+          <w:sz w:val="24"/>
+          <w:szCs w:val="24"/>
+        </w:rPr>
+        <w:t xml:space="preserve"> </w:t>
+      </w:r>
+      <w:r>
+        <w:rPr>
+          <w:b/>
+          <w:bCs/>
+          <w:sz w:val="24"/>
+          <w:szCs w:val="24"/>
+        </w:rPr>
+        <w:t xml:space="preserve">vybraných </w:t>
+      </w:r>
+      <w:r>
+        <w:rPr>
+          <w:b/>
+          <w:bCs/>
+          <w:sz w:val="24"/>
+          <w:szCs w:val="24"/>
+        </w:rPr>
+        <w:t xml:space="preserve">akciových </w:t>
+      </w:r>
+      <w:r>
+        <w:rPr>
+          <w:b/>
+          <w:bCs/>
+          <w:sz w:val="24"/>
+          <w:szCs w:val="24"/>
+        </w:rPr>
+        <w:t>indexov</w:t>
+      </w:r>
+      <w:r>
+        <w:rPr>
+          <w:b/>
+          <w:bCs/>
+          <w:sz w:val="24"/>
+          <w:szCs w:val="24"/>
+        </w:rPr>
+        <w:t xml:space="preserve"> USA, Európy a Číny</w:t>
+      </w:r>
+      <w:r>
+        <w:rPr>
+          <w:b/>
+          <w:bCs/>
+          <w:sz w:val="24"/>
+          <w:szCs w:val="24"/>
+        </w:rPr>
+        <w:t>.</w:t>
+      </w:r>
     </w:p>
     <w:p>
       <w:pPr>
@@ -1559,10 +1766,64 @@
         <w:rPr>
           <w:b/>
           <w:bCs/>
-          <w:sz w:val="28"/>
-          <w:szCs w:val="28"/>
+          <w:sz w:val="24"/>
+          <w:szCs w:val="24"/>
         </w:rPr>
       </w:pPr>
+      <w:r>
+        <w:rPr>
+          <w:b/>
+          <w:bCs/>
+          <w:sz w:val="24"/>
+          <w:szCs w:val="24"/>
+        </w:rPr>
+        <w:t xml:space="preserve">H2: </w:t>
+      </w:r>
+      <w:r>
+        <w:rPr>
+          <w:b/>
+          <w:bCs/>
+          <w:sz w:val="24"/>
+          <w:szCs w:val="24"/>
+        </w:rPr>
+        <w:t>Dynamika</w:t>
+      </w:r>
+      <w:r>
+        <w:rPr>
+          <w:b/>
+          <w:bCs/>
+          <w:sz w:val="24"/>
+          <w:szCs w:val="24"/>
+        </w:rPr>
+        <w:t xml:space="preserve"> volatility sa medzi </w:t>
+      </w:r>
+      <w:r>
+        <w:rPr>
+          <w:b/>
+          <w:bCs/>
+          <w:sz w:val="24"/>
+          <w:szCs w:val="24"/>
+        </w:rPr>
+        <w:t xml:space="preserve">vybranými trhmi </w:t>
+      </w:r>
+      <w:r>
+        <w:rPr>
+          <w:b/>
+          <w:bCs/>
+          <w:sz w:val="24"/>
+          <w:szCs w:val="24"/>
+        </w:rPr>
+        <w:t>USA, Európy a Číny štatisticky významne líši</w:t>
+      </w:r>
+      <w:r>
+        <w:rPr>
+          <w:b/>
+          <w:bCs/>
+          <w:sz w:val="24"/>
+          <w:szCs w:val="24"/>
+        </w:rPr>
+        <w:t>.</w:t>
+      </w:r>
     </w:p>
     <w:p>
       <w:pPr>
@@ -1570,10 +1831,37 @@
         <w:rPr>
           <w:b/>
           <w:bCs/>
-          <w:sz w:val="28"/>
-          <w:szCs w:val="28"/>
+          <w:sz w:val="24"/>
+          <w:szCs w:val="24"/>
         </w:rPr>
       </w:pPr>
+      <w:r>
+        <w:rPr>
+          <w:b/>
+          <w:bCs/>
+          <w:sz w:val="24"/>
+          <w:szCs w:val="24"/>
+        </w:rPr>
+        <w:t>H</w:t>
+      </w:r>
+      <w:r>
+        <w:rPr>
+          <w:b/>
+          <w:bCs/>
+          <w:sz w:val="24"/>
+          <w:szCs w:val="24"/>
+        </w:rPr>
+        <w:t>3</w:t>
+      </w:r>
+      <w:r>
+        <w:rPr>
+          <w:b/>
+          <w:bCs/>
+          <w:sz w:val="24"/>
+          <w:szCs w:val="24"/>
+        </w:rPr>
+        <w:t>: Asymetrické modely volatility dosahujú lepšiu výkonnosť počas krízových období ako symetrické modely volatility.</w:t>
+      </w:r>
     </w:p>
     <w:p>
       <w:pPr>
@@ -1581,10 +1869,100 @@
         <w:rPr>
           <w:b/>
           <w:bCs/>
-          <w:sz w:val="28"/>
-          <w:szCs w:val="28"/>
+          <w:sz w:val="24"/>
+          <w:szCs w:val="24"/>
         </w:rPr>
       </w:pPr>
+      <w:r>
+        <w:rPr>
+          <w:b/>
+          <w:bCs/>
+          <w:sz w:val="24"/>
+          <w:szCs w:val="24"/>
+        </w:rPr>
+        <w:t>H</w:t>
+      </w:r>
+      <w:r>
+        <w:rPr>
+          <w:b/>
+          <w:bCs/>
+          <w:sz w:val="24"/>
+          <w:szCs w:val="24"/>
+        </w:rPr>
+        <w:t>4</w:t>
+      </w:r>
+      <w:r>
+        <w:rPr>
+          <w:b/>
+          <w:bCs/>
+          <w:sz w:val="24"/>
+          <w:szCs w:val="24"/>
+        </w:rPr>
+        <w:t xml:space="preserve">: Metódy </w:t>
+      </w:r>
+      <w:r>
+        <w:rPr>
+          <w:b/>
+          <w:bCs/>
+          <w:sz w:val="24"/>
+          <w:szCs w:val="24"/>
+        </w:rPr>
+        <w:t>strojového a hlbokého učenia</w:t>
+      </w:r>
+      <w:r>
+        <w:rPr>
+          <w:b/>
+          <w:bCs/>
+          <w:sz w:val="24"/>
+          <w:szCs w:val="24"/>
+        </w:rPr>
+        <w:t xml:space="preserve"> nemajú štatisticky významne vyššiu predikčnú výkonnosť</w:t>
+      </w:r>
+      <w:r>
+        <w:rPr>
+          <w:b/>
+          <w:bCs/>
+          <w:sz w:val="24"/>
+          <w:szCs w:val="24"/>
+        </w:rPr>
+        <w:t xml:space="preserve"> ako </w:t>
+      </w:r>
+      <w:r>
+        <w:rPr>
+          <w:b/>
+          <w:bCs/>
+          <w:sz w:val="24"/>
+          <w:szCs w:val="24"/>
+        </w:rPr>
+        <w:t xml:space="preserve">vybrané </w:t>
+      </w:r>
+      <w:r>
+        <w:rPr>
+          <w:b/>
+          <w:bCs/>
+          <w:sz w:val="24"/>
+          <w:szCs w:val="24"/>
+        </w:rPr>
+        <w:t>ekonometrické modely</w:t>
+      </w:r>
+      <w:r>
+        <w:rPr>
+          <w:b/>
+          <w:bCs/>
+          <w:sz w:val="24"/>
+          <w:szCs w:val="24"/>
+        </w:rPr>
+        <w:t xml:space="preserve"> volatility</w:t>
+      </w:r>
+      <w:r>
+        <w:rPr>
+          <w:b/>
+          <w:bCs/>
+          <w:sz w:val="24"/>
+          <w:szCs w:val="24"/>
+        </w:rPr>
+        <w:t>.</w:t>
+      </w:r>
     </w:p>
     <w:p>
       <w:pPr>
@@ -1592,18 +1970,65 @@
         <w:rPr>
           <w:b/>
           <w:bCs/>
-          <w:sz w:val="28"/>
-          <w:szCs w:val="28"/>
+          <w:sz w:val="24"/>
+          <w:szCs w:val="24"/>
         </w:rPr>
       </w:pPr>
       <w:r>
+        <w:rPr>
+          <w:b/>
+          <w:bCs/>
+          <w:sz w:val="24"/>
+          <w:szCs w:val="24"/>
+        </w:rPr>
+        <w:lastRenderedPageBreak/>
+        <w:t>H</w:t>
+      </w:r>
+      <w:r>
+        <w:rPr>
+          <w:b/>
+          <w:bCs/>
+          <w:sz w:val="24"/>
+          <w:szCs w:val="24"/>
+        </w:rPr>
+        <w:t>5</w:t>
+      </w:r>
+      <w:r>
+        <w:rPr>
+          <w:b/>
+          <w:bCs/>
+          <w:sz w:val="24"/>
+          <w:szCs w:val="24"/>
+        </w:rPr>
+        <w:t xml:space="preserve">: </w:t>
+      </w:r>
+      <w:r>
+        <w:rPr>
+          <w:b/>
+          <w:bCs/>
+          <w:sz w:val="24"/>
+          <w:szCs w:val="24"/>
+        </w:rPr>
+        <w:t>Identifikované vzory volatility akciových trhov sa pri použití porovnateľných zdrojov dát štatisticky významne nemenia.</w:t>
+      </w:r>
+    </w:p>
+    <w:p>
+      <w:pPr>
+        <w:jc w:val="both"/>
         <w:rPr>
           <w:b/>
           <w:bCs/>
           <w:sz w:val="28"/>
           <w:szCs w:val="28"/>
         </w:rPr>
-        <w:lastRenderedPageBreak/>
+      </w:pPr>
+      <w:r>
+        <w:rPr>
+          <w:b/>
+          <w:bCs/>
+          <w:sz w:val="28"/>
+          <w:szCs w:val="28"/>
+        </w:rPr>
         <w:t>Návrh metodológie výskumu</w:t>
       </w:r>
     </w:p>
@@ -1615,15 +2040,79 @@
           <w:szCs w:val="24"/>
         </w:rPr>
       </w:pPr>
+      <w:r>
+        <w:rPr>
+          <w:b/>
+          <w:bCs/>
+          <w:sz w:val="28"/>
+          <w:szCs w:val="28"/>
+        </w:rPr>
+        <w:tab/>
+      </w:r>
+      <w:r>
+        <w:rPr>
+          <w:sz w:val="24"/>
+          <w:szCs w:val="24"/>
+        </w:rPr>
+        <w:t xml:space="preserve">Metodika výskumu dizertačnej práce bude vychádzať z kombinácie štandardných ekonometrických </w:t>
+      </w:r>
+      <w:r>
+        <w:rPr>
+          <w:sz w:val="24"/>
+          <w:szCs w:val="24"/>
+        </w:rPr>
+        <w:t>prístupov a metód umelej inteligencie. Výskum bude založený na časových radoch</w:t>
+      </w:r>
+      <w:r>
+        <w:rPr>
+          <w:sz w:val="24"/>
+          <w:szCs w:val="24"/>
+        </w:rPr>
+        <w:t xml:space="preserve"> vybraných</w:t>
+      </w:r>
+      <w:r>
+        <w:rPr>
+          <w:sz w:val="24"/>
+          <w:szCs w:val="24"/>
+        </w:rPr>
+        <w:t xml:space="preserve"> indexov akcií USA, Európy a Číny. Cieľom je zachytiť</w:t>
+      </w:r>
+      <w:r>
+        <w:rPr>
+          <w:sz w:val="24"/>
+          <w:szCs w:val="24"/>
+        </w:rPr>
+        <w:t xml:space="preserve"> </w:t>
+      </w:r>
+      <w:r>
+        <w:rPr>
+          <w:sz w:val="24"/>
+          <w:szCs w:val="24"/>
+        </w:rPr>
+        <w:t>volatilitu akciových trhov a identifikovať správanie trhov počas krízových geopolitických šokov.</w:t>
+      </w:r>
     </w:p>
     <w:p>
       <w:pPr>
         <w:jc w:val="both"/>
         <w:rPr>
-          <w:sz w:val="24"/>
-          <w:szCs w:val="24"/>
+          <w:b/>
+          <w:bCs/>
+          <w:sz w:val="24"/>
+          <w:szCs w:val="24"/>
+          <w:u w:val="thick"/>
         </w:rPr>
       </w:pPr>
+      <w:r>
+        <w:rPr>
+          <w:b/>
+          <w:bCs/>
+          <w:sz w:val="24"/>
+          <w:szCs w:val="24"/>
+          <w:u w:val="thick"/>
+        </w:rPr>
+        <w:t>Získanie dát pre výskum</w:t>
+      </w:r>
     </w:p>
     <w:p>
       <w:pPr>
@@ -1633,15 +2122,341 @@
           <w:szCs w:val="24"/>
         </w:rPr>
       </w:pPr>
+      <w:r>
+        <w:rPr>
+          <w:sz w:val="24"/>
+          <w:szCs w:val="24"/>
+        </w:rPr>
+        <w:tab/>
+        <w:t xml:space="preserve">Dáta pre výskumnú časť dizertačnej práce budú získané vo forme časových radov </w:t>
+      </w:r>
+      <w:r>
+        <w:rPr>
+          <w:sz w:val="24"/>
+          <w:szCs w:val="24"/>
+        </w:rPr>
+        <w:t xml:space="preserve">vybraných </w:t>
+      </w:r>
+      <w:r>
+        <w:rPr>
+          <w:sz w:val="24"/>
+          <w:szCs w:val="24"/>
+        </w:rPr>
+        <w:t>indexov</w:t>
+      </w:r>
+      <w:r>
+        <w:rPr>
+          <w:sz w:val="24"/>
+          <w:szCs w:val="24"/>
+        </w:rPr>
+        <w:t xml:space="preserve"> USA, Európy a Číny, pričom budú rozdelené na 3 časti:</w:t>
+      </w:r>
+    </w:p>
+    <w:p>
+      <w:pPr>
+        <w:pStyle w:val="Odsekzoznamu"/>
+        <w:numPr>
+          <w:ilvl w:val="0"/>
+          <w:numId w:val="1"/>
+        </w:numPr>
+        <w:jc w:val="both"/>
+        <w:rPr>
+          <w:sz w:val="24"/>
+          <w:szCs w:val="24"/>
+        </w:rPr>
+      </w:pPr>
+      <w:r>
+        <w:rPr>
+          <w:sz w:val="24"/>
+          <w:szCs w:val="24"/>
+        </w:rPr>
+        <w:t>Obdobie pred pandémiou (2016-2019),</w:t>
+      </w:r>
+    </w:p>
+    <w:p>
+      <w:pPr>
+        <w:pStyle w:val="Odsekzoznamu"/>
+        <w:numPr>
+          <w:ilvl w:val="0"/>
+          <w:numId w:val="1"/>
+        </w:numPr>
+        <w:jc w:val="both"/>
+        <w:rPr>
+          <w:sz w:val="24"/>
+          <w:szCs w:val="24"/>
+        </w:rPr>
+      </w:pPr>
+      <w:r>
+        <w:rPr>
+          <w:sz w:val="24"/>
+          <w:szCs w:val="24"/>
+        </w:rPr>
+        <w:t>Obdobie COVID-19 (2020-202</w:t>
+      </w:r>
+      <w:r>
+        <w:rPr>
+          <w:sz w:val="24"/>
+          <w:szCs w:val="24"/>
+        </w:rPr>
+        <w:t>2</w:t>
+      </w:r>
+      <w:r>
+        <w:rPr>
+          <w:sz w:val="24"/>
+          <w:szCs w:val="24"/>
+        </w:rPr>
+        <w:t>),</w:t>
+      </w:r>
+    </w:p>
+    <w:p>
+      <w:pPr>
+        <w:pStyle w:val="Odsekzoznamu"/>
+        <w:numPr>
+          <w:ilvl w:val="0"/>
+          <w:numId w:val="1"/>
+        </w:numPr>
+        <w:jc w:val="both"/>
+        <w:rPr>
+          <w:sz w:val="24"/>
+          <w:szCs w:val="24"/>
+        </w:rPr>
+      </w:pPr>
+      <w:proofErr w:type="spellStart"/>
+      <w:r>
+        <w:rPr>
+          <w:sz w:val="24"/>
+          <w:szCs w:val="24"/>
+        </w:rPr>
+        <w:t>postpandemické</w:t>
+      </w:r>
+      <w:proofErr w:type="spellEnd"/>
+      <w:r>
+        <w:rPr>
+          <w:sz w:val="24"/>
+          <w:szCs w:val="24"/>
+        </w:rPr>
+        <w:t xml:space="preserve"> obdobie (202</w:t>
+      </w:r>
+      <w:r>
+        <w:rPr>
+          <w:sz w:val="24"/>
+          <w:szCs w:val="24"/>
+        </w:rPr>
+        <w:t>3</w:t>
+      </w:r>
+      <w:r>
+        <w:rPr>
+          <w:sz w:val="24"/>
+          <w:szCs w:val="24"/>
+        </w:rPr>
+        <w:t>-2026).</w:t>
+      </w:r>
+    </w:p>
+    <w:p>
+      <w:pPr>
+        <w:ind w:firstLine="708"/>
+        <w:jc w:val="both"/>
+        <w:rPr>
+          <w:sz w:val="24"/>
+          <w:szCs w:val="24"/>
+        </w:rPr>
+      </w:pPr>
+      <w:r>
+        <w:rPr>
+          <w:sz w:val="24"/>
+          <w:szCs w:val="24"/>
+        </w:rPr>
+        <w:t xml:space="preserve">Spomínané dáta budú získané z portálov </w:t>
+      </w:r>
+      <w:r>
+        <w:rPr>
+          <w:i/>
+          <w:iCs/>
+          <w:sz w:val="24"/>
+          <w:szCs w:val="24"/>
+        </w:rPr>
+        <w:t>Stooq.pl</w:t>
+      </w:r>
+      <w:r>
+        <w:rPr>
+          <w:sz w:val="24"/>
+          <w:szCs w:val="24"/>
+        </w:rPr>
+        <w:t xml:space="preserve"> a </w:t>
+      </w:r>
+      <w:r>
+        <w:rPr>
+          <w:i/>
+          <w:iCs/>
+          <w:sz w:val="24"/>
+          <w:szCs w:val="24"/>
+        </w:rPr>
+        <w:t xml:space="preserve">Yahoo </w:t>
+      </w:r>
+      <w:proofErr w:type="spellStart"/>
+      <w:r>
+        <w:rPr>
+          <w:i/>
+          <w:iCs/>
+          <w:sz w:val="24"/>
+          <w:szCs w:val="24"/>
+        </w:rPr>
+        <w:t>Finance</w:t>
+      </w:r>
+      <w:proofErr w:type="spellEnd"/>
+      <w:r>
+        <w:rPr>
+          <w:sz w:val="24"/>
+          <w:szCs w:val="24"/>
+        </w:rPr>
+        <w:t xml:space="preserve">, pričom budú použité dáta indexov </w:t>
+      </w:r>
+      <w:r>
+        <w:rPr>
+          <w:i/>
+          <w:iCs/>
+          <w:sz w:val="24"/>
+          <w:szCs w:val="24"/>
+        </w:rPr>
+        <w:t>S&amp;P 500</w:t>
+      </w:r>
+      <w:r>
+        <w:rPr>
+          <w:sz w:val="24"/>
+          <w:szCs w:val="24"/>
+        </w:rPr>
+        <w:t xml:space="preserve"> pre USA,</w:t>
+      </w:r>
+      <w:r>
+        <w:rPr>
+          <w:sz w:val="24"/>
+          <w:szCs w:val="24"/>
+        </w:rPr>
+        <w:t xml:space="preserve"> </w:t>
+      </w:r>
+      <w:r>
+        <w:rPr>
+          <w:sz w:val="24"/>
+          <w:szCs w:val="24"/>
+        </w:rPr>
+        <w:t>n</w:t>
+      </w:r>
+      <w:r>
+        <w:rPr>
+          <w:sz w:val="24"/>
+          <w:szCs w:val="24"/>
+        </w:rPr>
+        <w:t>emecký</w:t>
+      </w:r>
+      <w:r>
+        <w:rPr>
+          <w:sz w:val="24"/>
+          <w:szCs w:val="24"/>
+        </w:rPr>
+        <w:t xml:space="preserve"> </w:t>
+      </w:r>
+      <w:r>
+        <w:rPr>
+          <w:i/>
+          <w:iCs/>
+          <w:sz w:val="24"/>
+          <w:szCs w:val="24"/>
+        </w:rPr>
+        <w:t>DAX</w:t>
+      </w:r>
+      <w:r>
+        <w:rPr>
+          <w:sz w:val="24"/>
+          <w:szCs w:val="24"/>
+        </w:rPr>
+        <w:t xml:space="preserve"> </w:t>
+      </w:r>
+      <w:r>
+        <w:rPr>
+          <w:sz w:val="24"/>
+          <w:szCs w:val="24"/>
+        </w:rPr>
+        <w:t>ako vybraný európsky trh</w:t>
+      </w:r>
+      <w:r>
+        <w:rPr>
+          <w:sz w:val="24"/>
+          <w:szCs w:val="24"/>
+        </w:rPr>
+        <w:t xml:space="preserve"> a</w:t>
+      </w:r>
+      <w:r>
+        <w:rPr>
+          <w:sz w:val="24"/>
+          <w:szCs w:val="24"/>
+        </w:rPr>
+        <w:t> </w:t>
+      </w:r>
+      <w:r>
+        <w:rPr>
+          <w:i/>
+          <w:iCs/>
+          <w:sz w:val="24"/>
+          <w:szCs w:val="24"/>
+        </w:rPr>
+        <w:t>SSE</w:t>
+      </w:r>
+      <w:r>
+        <w:rPr>
+          <w:i/>
+          <w:iCs/>
+          <w:sz w:val="24"/>
+          <w:szCs w:val="24"/>
+        </w:rPr>
+        <w:t xml:space="preserve"> </w:t>
+      </w:r>
+      <w:proofErr w:type="spellStart"/>
+      <w:r>
+        <w:rPr>
+          <w:i/>
+          <w:iCs/>
+          <w:sz w:val="24"/>
+          <w:szCs w:val="24"/>
+        </w:rPr>
+        <w:t>Composite</w:t>
+      </w:r>
+      <w:proofErr w:type="spellEnd"/>
+      <w:r>
+        <w:rPr>
+          <w:sz w:val="24"/>
+          <w:szCs w:val="24"/>
+        </w:rPr>
+        <w:t xml:space="preserve"> pre Čínu.</w:t>
+      </w:r>
+      <w:r>
+        <w:rPr>
+          <w:sz w:val="24"/>
+          <w:szCs w:val="24"/>
+        </w:rPr>
+        <w:t xml:space="preserve"> Výsledky z oboch spomínaných zdrojov budú porovnané s cieľom zistiť, či sa výstup zmení pri odlišnom zdroji dát.</w:t>
+      </w:r>
     </w:p>
     <w:p>
       <w:pPr>
         <w:jc w:val="both"/>
         <w:rPr>
-          <w:sz w:val="24"/>
-          <w:szCs w:val="24"/>
+          <w:b/>
+          <w:bCs/>
+          <w:sz w:val="24"/>
+          <w:szCs w:val="24"/>
+          <w:u w:val="thick"/>
         </w:rPr>
       </w:pPr>
+      <w:r>
+        <w:rPr>
+          <w:b/>
+          <w:bCs/>
+          <w:sz w:val="24"/>
+          <w:szCs w:val="24"/>
+          <w:u w:val="thick"/>
+        </w:rPr>
+        <w:t>Spracovanie dát</w:t>
+      </w:r>
     </w:p>
     <w:p>
       <w:pPr>
@@ -1651,15 +2466,146 @@
           <w:szCs w:val="24"/>
         </w:rPr>
       </w:pPr>
+      <w:r>
+        <w:rPr>
+          <w:sz w:val="24"/>
+          <w:szCs w:val="24"/>
+        </w:rPr>
+        <w:tab/>
+      </w:r>
+      <w:r>
+        <w:rPr>
+          <w:sz w:val="24"/>
+          <w:szCs w:val="24"/>
+        </w:rPr>
+        <w:t xml:space="preserve">Spracovanie dát zahŕňa </w:t>
+      </w:r>
+      <w:r>
+        <w:rPr>
+          <w:sz w:val="24"/>
+          <w:szCs w:val="24"/>
+        </w:rPr>
+        <w:t>získanie historických denných cien spomínaných indexov, ktoré budú následne kontrolované z hľadiska úplnosti a konzistencie. To znamená zjednotenie časového obdobia, odstránenie chýbajúcich hodnôt</w:t>
+      </w:r>
+      <w:r>
+        <w:rPr>
+          <w:sz w:val="24"/>
+          <w:szCs w:val="24"/>
+        </w:rPr>
+        <w:t xml:space="preserve">. Dáta budú </w:t>
+      </w:r>
+      <w:r>
+        <w:rPr>
+          <w:sz w:val="24"/>
+          <w:szCs w:val="24"/>
+        </w:rPr>
+        <w:t>transform</w:t>
+      </w:r>
+      <w:r>
+        <w:rPr>
+          <w:sz w:val="24"/>
+          <w:szCs w:val="24"/>
+        </w:rPr>
+        <w:t>ované</w:t>
+      </w:r>
+      <w:r>
+        <w:rPr>
+          <w:sz w:val="24"/>
+          <w:szCs w:val="24"/>
+        </w:rPr>
+        <w:t xml:space="preserve"> </w:t>
+      </w:r>
+      <w:r>
+        <w:rPr>
+          <w:sz w:val="24"/>
+          <w:szCs w:val="24"/>
+        </w:rPr>
+        <w:t>na logaritmické výnosy</w:t>
+      </w:r>
+      <w:r>
+        <w:rPr>
+          <w:sz w:val="24"/>
+          <w:szCs w:val="24"/>
+        </w:rPr>
+        <w:t xml:space="preserve"> a následne budú analyzované ich vlastnosti ako </w:t>
+      </w:r>
+      <w:proofErr w:type="spellStart"/>
+      <w:r>
+        <w:rPr>
+          <w:sz w:val="24"/>
+          <w:szCs w:val="24"/>
+        </w:rPr>
+        <w:t>stacionarita</w:t>
+      </w:r>
+      <w:proofErr w:type="spellEnd"/>
+      <w:r>
+        <w:rPr>
+          <w:sz w:val="24"/>
+          <w:szCs w:val="24"/>
+        </w:rPr>
+        <w:t xml:space="preserve">, </w:t>
+      </w:r>
+      <w:proofErr w:type="spellStart"/>
+      <w:r>
+        <w:rPr>
+          <w:sz w:val="24"/>
+          <w:szCs w:val="24"/>
+        </w:rPr>
+        <w:t>autokorelácia</w:t>
+      </w:r>
+      <w:proofErr w:type="spellEnd"/>
+      <w:r>
+        <w:rPr>
+          <w:sz w:val="24"/>
+          <w:szCs w:val="24"/>
+        </w:rPr>
+        <w:t xml:space="preserve"> a </w:t>
+      </w:r>
+      <w:proofErr w:type="spellStart"/>
+      <w:r>
+        <w:rPr>
+          <w:sz w:val="24"/>
+          <w:szCs w:val="24"/>
+        </w:rPr>
+        <w:t>heteroskedasticita</w:t>
+      </w:r>
+      <w:proofErr w:type="spellEnd"/>
+      <w:r>
+        <w:rPr>
+          <w:sz w:val="24"/>
+          <w:szCs w:val="24"/>
+        </w:rPr>
+        <w:t xml:space="preserve">. </w:t>
+      </w:r>
+      <w:r>
+        <w:rPr>
+          <w:sz w:val="24"/>
+          <w:szCs w:val="24"/>
+        </w:rPr>
+        <w:t xml:space="preserve">Takto predspracované dáta budú ďalej vhodné ako vstup pre ekonometrické modely a metódy umelej inteligencie. </w:t>
+      </w:r>
     </w:p>
     <w:p>
       <w:pPr>
         <w:jc w:val="both"/>
         <w:rPr>
-          <w:sz w:val="24"/>
-          <w:szCs w:val="24"/>
+          <w:b/>
+          <w:bCs/>
+          <w:sz w:val="24"/>
+          <w:szCs w:val="24"/>
+          <w:u w:val="thick"/>
         </w:rPr>
       </w:pPr>
+      <w:r>
+        <w:rPr>
+          <w:b/>
+          <w:bCs/>
+          <w:sz w:val="24"/>
+          <w:szCs w:val="24"/>
+          <w:u w:val="thick"/>
+        </w:rPr>
+        <w:t>Modelovanie</w:t>
+      </w:r>
     </w:p>
     <w:p>
       <w:pPr>
@@ -1669,15 +2615,271 @@
           <w:szCs w:val="24"/>
         </w:rPr>
       </w:pPr>
+      <w:r>
+        <w:rPr>
+          <w:sz w:val="24"/>
+          <w:szCs w:val="24"/>
+        </w:rPr>
+        <w:tab/>
+        <w:t xml:space="preserve">Za účelom modelovania </w:t>
+      </w:r>
+      <w:r>
+        <w:rPr>
+          <w:sz w:val="24"/>
+          <w:szCs w:val="24"/>
+        </w:rPr>
+        <w:t>budú</w:t>
+      </w:r>
+      <w:r>
+        <w:rPr>
+          <w:sz w:val="24"/>
+          <w:szCs w:val="24"/>
+        </w:rPr>
+        <w:t xml:space="preserve"> zvol</w:t>
+      </w:r>
+      <w:r>
+        <w:rPr>
+          <w:sz w:val="24"/>
+          <w:szCs w:val="24"/>
+        </w:rPr>
+        <w:t>ené</w:t>
+      </w:r>
+      <w:r>
+        <w:rPr>
+          <w:sz w:val="24"/>
+          <w:szCs w:val="24"/>
+        </w:rPr>
+        <w:t xml:space="preserve"> vhodné ekonometrické</w:t>
+      </w:r>
+      <w:r>
+        <w:rPr>
+          <w:sz w:val="24"/>
+          <w:szCs w:val="24"/>
+        </w:rPr>
+        <w:t xml:space="preserve"> modely</w:t>
+      </w:r>
+      <w:r>
+        <w:rPr>
+          <w:sz w:val="24"/>
+          <w:szCs w:val="24"/>
+        </w:rPr>
+        <w:t xml:space="preserve"> aj modely strojového učenia s cieľom porovnať ich výkonnosť </w:t>
+      </w:r>
+      <w:r>
+        <w:rPr>
+          <w:sz w:val="24"/>
+          <w:szCs w:val="24"/>
+        </w:rPr>
+        <w:t>pri</w:t>
+      </w:r>
+      <w:r>
+        <w:rPr>
+          <w:sz w:val="24"/>
+          <w:szCs w:val="24"/>
+        </w:rPr>
+        <w:t xml:space="preserve"> predikcii </w:t>
+      </w:r>
+      <w:r>
+        <w:rPr>
+          <w:sz w:val="24"/>
+          <w:szCs w:val="24"/>
+        </w:rPr>
+        <w:t>volatility</w:t>
+      </w:r>
+      <w:r>
+        <w:rPr>
+          <w:sz w:val="24"/>
+          <w:szCs w:val="24"/>
+        </w:rPr>
+        <w:t xml:space="preserve">. Ako ekonometrický benchmark bude použitý model </w:t>
+      </w:r>
+      <w:r>
+        <w:rPr>
+          <w:i/>
+          <w:iCs/>
+          <w:sz w:val="24"/>
+          <w:szCs w:val="24"/>
+        </w:rPr>
+        <w:t>GARCH</w:t>
+      </w:r>
+      <w:r>
+        <w:rPr>
+          <w:i/>
+          <w:iCs/>
+          <w:sz w:val="24"/>
+          <w:szCs w:val="24"/>
+          <w:lang w:val="en-US"/>
+        </w:rPr>
+        <w:t>(1,1)</w:t>
+      </w:r>
+      <w:r>
+        <w:rPr>
+          <w:sz w:val="24"/>
+          <w:szCs w:val="24"/>
+          <w:lang w:val="en-US"/>
+        </w:rPr>
+        <w:t xml:space="preserve">, </w:t>
+      </w:r>
+      <w:r>
+        <w:rPr>
+          <w:sz w:val="24"/>
+          <w:szCs w:val="24"/>
+        </w:rPr>
+        <w:t xml:space="preserve">asymetrický </w:t>
+      </w:r>
+      <w:r>
+        <w:rPr>
+          <w:i/>
+          <w:iCs/>
+          <w:sz w:val="24"/>
+          <w:szCs w:val="24"/>
+        </w:rPr>
+        <w:t>GJR-GARCH</w:t>
+      </w:r>
+      <w:r>
+        <w:rPr>
+          <w:sz w:val="24"/>
+          <w:szCs w:val="24"/>
+        </w:rPr>
+        <w:t xml:space="preserve"> model</w:t>
+      </w:r>
+      <w:r>
+        <w:rPr>
+          <w:sz w:val="24"/>
+          <w:szCs w:val="24"/>
+        </w:rPr>
+        <w:t xml:space="preserve">, ako aj model z rodiny </w:t>
+      </w:r>
+      <w:r>
+        <w:rPr>
+          <w:i/>
+          <w:iCs/>
+          <w:sz w:val="24"/>
+          <w:szCs w:val="24"/>
+        </w:rPr>
+        <w:t>HAR</w:t>
+      </w:r>
+      <w:r>
+        <w:rPr>
+          <w:sz w:val="24"/>
+          <w:szCs w:val="24"/>
+        </w:rPr>
+        <w:t xml:space="preserve">. Z metód umelej inteligencie budú použité modely </w:t>
+      </w:r>
+      <w:proofErr w:type="spellStart"/>
+      <w:r>
+        <w:rPr>
+          <w:i/>
+          <w:iCs/>
+          <w:sz w:val="24"/>
+          <w:szCs w:val="24"/>
+        </w:rPr>
+        <w:t>XGBoost</w:t>
+      </w:r>
+      <w:proofErr w:type="spellEnd"/>
+      <w:r>
+        <w:rPr>
+          <w:sz w:val="24"/>
+          <w:szCs w:val="24"/>
+        </w:rPr>
+        <w:t xml:space="preserve"> a </w:t>
+      </w:r>
+      <w:r>
+        <w:rPr>
+          <w:i/>
+          <w:iCs/>
+          <w:sz w:val="24"/>
+          <w:szCs w:val="24"/>
+        </w:rPr>
+        <w:t>LSTM</w:t>
+      </w:r>
+      <w:r>
+        <w:rPr>
+          <w:sz w:val="24"/>
+          <w:szCs w:val="24"/>
+        </w:rPr>
+        <w:t>, ktoré umožnia zachytiť nelineárne vzťahy časových radov.</w:t>
+      </w:r>
+      <w:r>
+        <w:rPr>
+          <w:sz w:val="24"/>
+          <w:szCs w:val="24"/>
+        </w:rPr>
+        <w:t xml:space="preserve"> Volatilita bude vyjadrená štvorcami logaritmických výnosov, pričom</w:t>
+      </w:r>
+      <w:r>
+        <w:rPr>
+          <w:sz w:val="24"/>
+          <w:szCs w:val="24"/>
+        </w:rPr>
+        <w:t xml:space="preserve"> </w:t>
+      </w:r>
+      <w:r>
+        <w:rPr>
+          <w:sz w:val="24"/>
+          <w:szCs w:val="24"/>
+        </w:rPr>
+        <w:t>samotné m</w:t>
+      </w:r>
+      <w:r>
+        <w:rPr>
+          <w:sz w:val="24"/>
+          <w:szCs w:val="24"/>
+        </w:rPr>
+        <w:t>odelovanie bude prebiehať na dátach Stooq.pl</w:t>
+      </w:r>
+      <w:r>
+        <w:rPr>
+          <w:sz w:val="24"/>
+          <w:szCs w:val="24"/>
+        </w:rPr>
+        <w:t xml:space="preserve"> </w:t>
+      </w:r>
+      <w:r>
+        <w:rPr>
+          <w:sz w:val="24"/>
+          <w:szCs w:val="24"/>
+        </w:rPr>
+        <w:t xml:space="preserve">a Yahoo </w:t>
+      </w:r>
+      <w:proofErr w:type="spellStart"/>
+      <w:r>
+        <w:rPr>
+          <w:sz w:val="24"/>
+          <w:szCs w:val="24"/>
+        </w:rPr>
+        <w:t>Finance</w:t>
+      </w:r>
+      <w:proofErr w:type="spellEnd"/>
+      <w:r>
+        <w:rPr>
+          <w:sz w:val="24"/>
+          <w:szCs w:val="24"/>
+        </w:rPr>
+        <w:t>, s cieľom otestovať robustnosť výsledkov.</w:t>
+      </w:r>
     </w:p>
     <w:p>
       <w:pPr>
         <w:jc w:val="both"/>
         <w:rPr>
-          <w:sz w:val="24"/>
-          <w:szCs w:val="24"/>
+          <w:b/>
+          <w:bCs/>
+          <w:sz w:val="24"/>
+          <w:szCs w:val="24"/>
+          <w:u w:val="thick"/>
         </w:rPr>
       </w:pPr>
+      <w:r>
+        <w:rPr>
+          <w:b/>
+          <w:bCs/>
+          <w:sz w:val="24"/>
+          <w:szCs w:val="24"/>
+          <w:u w:val="thick"/>
+        </w:rPr>
+        <w:t>Vyhodnotenie výsledkov</w:t>
+      </w:r>
     </w:p>
     <w:p>
       <w:pPr>
@@ -1687,177 +2889,132 @@
           <w:szCs w:val="24"/>
         </w:rPr>
       </w:pPr>
-    </w:p>
-    <w:p>
-      <w:pPr>
-        <w:jc w:val="both"/>
-        <w:rPr>
-          <w:sz w:val="24"/>
-          <w:szCs w:val="24"/>
-        </w:rPr>
-      </w:pPr>
-    </w:p>
-    <w:p>
-      <w:pPr>
-        <w:jc w:val="both"/>
-        <w:rPr>
-          <w:sz w:val="24"/>
-          <w:szCs w:val="24"/>
-        </w:rPr>
-      </w:pPr>
-    </w:p>
-    <w:p>
-      <w:pPr>
-        <w:jc w:val="both"/>
-        <w:rPr>
-          <w:sz w:val="24"/>
-          <w:szCs w:val="24"/>
-        </w:rPr>
-      </w:pPr>
-    </w:p>
-    <w:p>
-      <w:pPr>
-        <w:jc w:val="both"/>
-        <w:rPr>
-          <w:sz w:val="24"/>
-          <w:szCs w:val="24"/>
-        </w:rPr>
-      </w:pPr>
-    </w:p>
-    <w:p>
-      <w:pPr>
-        <w:jc w:val="both"/>
-        <w:rPr>
-          <w:sz w:val="24"/>
-          <w:szCs w:val="24"/>
-        </w:rPr>
-      </w:pPr>
-    </w:p>
-    <w:p>
-      <w:pPr>
-        <w:jc w:val="both"/>
-        <w:rPr>
-          <w:sz w:val="24"/>
-          <w:szCs w:val="24"/>
-        </w:rPr>
-      </w:pPr>
-    </w:p>
-    <w:p>
-      <w:pPr>
-        <w:jc w:val="both"/>
-        <w:rPr>
-          <w:sz w:val="24"/>
-          <w:szCs w:val="24"/>
-        </w:rPr>
-      </w:pPr>
-    </w:p>
-    <w:p>
-      <w:pPr>
-        <w:jc w:val="both"/>
-        <w:rPr>
-          <w:sz w:val="24"/>
-          <w:szCs w:val="24"/>
-        </w:rPr>
-      </w:pPr>
-    </w:p>
-    <w:p>
-      <w:pPr>
-        <w:jc w:val="both"/>
-        <w:rPr>
-          <w:sz w:val="24"/>
-          <w:szCs w:val="24"/>
-        </w:rPr>
-      </w:pPr>
-    </w:p>
-    <w:p>
-      <w:pPr>
-        <w:jc w:val="both"/>
-        <w:rPr>
-          <w:sz w:val="24"/>
-          <w:szCs w:val="24"/>
-        </w:rPr>
-      </w:pPr>
-    </w:p>
-    <w:p>
-      <w:pPr>
-        <w:jc w:val="both"/>
-        <w:rPr>
-          <w:sz w:val="24"/>
-          <w:szCs w:val="24"/>
-        </w:rPr>
-      </w:pPr>
-    </w:p>
-    <w:p>
-      <w:pPr>
-        <w:jc w:val="both"/>
-        <w:rPr>
-          <w:sz w:val="24"/>
-          <w:szCs w:val="24"/>
-        </w:rPr>
-      </w:pPr>
-    </w:p>
-    <w:p>
-      <w:pPr>
-        <w:jc w:val="both"/>
-        <w:rPr>
-          <w:sz w:val="24"/>
-          <w:szCs w:val="24"/>
-        </w:rPr>
-      </w:pPr>
-    </w:p>
-    <w:p>
-      <w:pPr>
-        <w:jc w:val="both"/>
-        <w:rPr>
-          <w:sz w:val="24"/>
-          <w:szCs w:val="24"/>
-        </w:rPr>
-      </w:pPr>
-    </w:p>
-    <w:p>
-      <w:pPr>
-        <w:jc w:val="both"/>
-        <w:rPr>
-          <w:sz w:val="24"/>
-          <w:szCs w:val="24"/>
-        </w:rPr>
-      </w:pPr>
-    </w:p>
-    <w:p>
-      <w:pPr>
-        <w:jc w:val="both"/>
-        <w:rPr>
-          <w:sz w:val="24"/>
-          <w:szCs w:val="24"/>
-        </w:rPr>
-      </w:pPr>
-    </w:p>
-    <w:p>
-      <w:pPr>
-        <w:jc w:val="both"/>
-        <w:rPr>
-          <w:sz w:val="24"/>
-          <w:szCs w:val="24"/>
-        </w:rPr>
-      </w:pPr>
-    </w:p>
-    <w:p>
-      <w:pPr>
-        <w:jc w:val="both"/>
-        <w:rPr>
-          <w:sz w:val="24"/>
-          <w:szCs w:val="24"/>
-        </w:rPr>
-      </w:pPr>
-    </w:p>
-    <w:p>
-      <w:pPr>
-        <w:jc w:val="both"/>
-        <w:rPr>
-          <w:sz w:val="24"/>
-          <w:szCs w:val="24"/>
-        </w:rPr>
-      </w:pPr>
+      <w:r>
+        <w:rPr>
+          <w:sz w:val="24"/>
+          <w:szCs w:val="24"/>
+        </w:rPr>
+        <w:tab/>
+      </w:r>
+      <w:r>
+        <w:rPr>
+          <w:sz w:val="24"/>
+          <w:szCs w:val="24"/>
+        </w:rPr>
+        <w:t xml:space="preserve">Vyhodnotenie modelov bude realizované pomocou </w:t>
+      </w:r>
+      <w:proofErr w:type="spellStart"/>
+      <w:r>
+        <w:rPr>
+          <w:i/>
+          <w:iCs/>
+          <w:sz w:val="24"/>
+          <w:szCs w:val="24"/>
+        </w:rPr>
+        <w:t>rolling-window</w:t>
+      </w:r>
+      <w:proofErr w:type="spellEnd"/>
+      <w:r>
+        <w:rPr>
+          <w:sz w:val="24"/>
+          <w:szCs w:val="24"/>
+        </w:rPr>
+        <w:t xml:space="preserve"> prístupu, s cieľom zachovať časovú následnosť informácií. </w:t>
+      </w:r>
+      <w:r>
+        <w:rPr>
+          <w:sz w:val="24"/>
+          <w:szCs w:val="24"/>
+        </w:rPr>
+        <w:t xml:space="preserve">Za účelom porovnania a vyhodnotenia presnosti predikcie volatility bude použitá odmocnina z priemernej štvorcovej chyby </w:t>
+      </w:r>
+      <w:r>
+        <w:rPr>
+          <w:sz w:val="24"/>
+          <w:szCs w:val="24"/>
+          <w:lang w:val="en-US"/>
+        </w:rPr>
+        <w:t>(</w:t>
+      </w:r>
+      <w:r>
+        <w:rPr>
+          <w:i/>
+          <w:iCs/>
+          <w:sz w:val="24"/>
+          <w:szCs w:val="24"/>
+          <w:lang w:val="en-US"/>
+        </w:rPr>
+        <w:t>RMSE</w:t>
+      </w:r>
+      <w:r>
+        <w:rPr>
+          <w:sz w:val="24"/>
+          <w:szCs w:val="24"/>
+          <w:lang w:val="en-US"/>
+        </w:rPr>
+        <w:t xml:space="preserve">) </w:t>
+      </w:r>
+      <w:r>
+        <w:rPr>
+          <w:sz w:val="24"/>
+          <w:szCs w:val="24"/>
+        </w:rPr>
+        <w:t>ako všeobecná metrika predikčnej chyby, ktorá výrazne penalizuje odchýlky. Na hodnotenie modelov volatility</w:t>
+      </w:r>
+      <w:r>
+        <w:rPr>
+          <w:sz w:val="24"/>
+          <w:szCs w:val="24"/>
+        </w:rPr>
+        <w:t xml:space="preserve"> bude taktiež použitá </w:t>
+      </w:r>
+      <w:r>
+        <w:rPr>
+          <w:i/>
+          <w:iCs/>
+          <w:sz w:val="24"/>
+          <w:szCs w:val="24"/>
+        </w:rPr>
+        <w:t>QLIKE</w:t>
+      </w:r>
+      <w:r>
+        <w:rPr>
+          <w:sz w:val="24"/>
+          <w:szCs w:val="24"/>
+        </w:rPr>
+        <w:t>, ako metrika pre hodnotenie predikcie volatility</w:t>
+      </w:r>
+      <w:r>
+        <w:rPr>
+          <w:sz w:val="24"/>
+          <w:szCs w:val="24"/>
+        </w:rPr>
+        <w:t xml:space="preserve">. </w:t>
+      </w:r>
+      <w:r>
+        <w:rPr>
+          <w:sz w:val="24"/>
+          <w:szCs w:val="24"/>
+        </w:rPr>
+        <w:lastRenderedPageBreak/>
+        <w:t>Keďže metrika QLIKE vyžaduje výhradne kladné hodnoty volatility, pri modeloch LSTM a </w:t>
+      </w:r>
+      <w:proofErr w:type="spellStart"/>
+      <w:r>
+        <w:rPr>
+          <w:sz w:val="24"/>
+          <w:szCs w:val="24"/>
+        </w:rPr>
+        <w:t>XGBoost</w:t>
+      </w:r>
+      <w:proofErr w:type="spellEnd"/>
+      <w:r>
+        <w:rPr>
+          <w:sz w:val="24"/>
+          <w:szCs w:val="24"/>
+        </w:rPr>
+        <w:t xml:space="preserve"> bude použitá transformácia cieľovej premennej.</w:t>
+      </w:r>
     </w:p>
     <w:p>
       <w:pPr>
@@ -1883,7 +3040,6 @@
           <w:sz w:val="32"/>
           <w:szCs w:val="32"/>
         </w:rPr>
-        <w:lastRenderedPageBreak/>
         <w:t>Zoznam literatúry</w:t>
       </w:r>
     </w:p>
@@ -1905,7 +3061,7 @@
             <w:autoSpaceDE w:val="0"/>
             <w:autoSpaceDN w:val="0"/>
             <w:ind w:hanging="480"/>
-            <w:divId w:val="886336374"/>
+            <w:divId w:val="2021346103"/>
             <w:rPr>
               <w:rFonts w:ascii="Calibri" w:eastAsia="Times New Roman" w:hAnsi="Calibri" w:cs="Calibri"/>
               <w:color w:val="000000"/>
@@ -2138,7 +3294,7 @@
             <w:autoSpaceDE w:val="0"/>
             <w:autoSpaceDN w:val="0"/>
             <w:ind w:hanging="480"/>
-            <w:divId w:val="426192237"/>
+            <w:divId w:val="1488209006"/>
             <w:rPr>
               <w:rFonts w:ascii="Calibri" w:eastAsia="Times New Roman" w:hAnsi="Calibri" w:cs="Calibri"/>
               <w:color w:val="000000"/>
@@ -2458,7 +3614,7 @@
             <w:autoSpaceDE w:val="0"/>
             <w:autoSpaceDN w:val="0"/>
             <w:ind w:hanging="480"/>
-            <w:divId w:val="825588739"/>
+            <w:divId w:val="1220633594"/>
             <w:rPr>
               <w:rFonts w:ascii="Calibri" w:eastAsia="Times New Roman" w:hAnsi="Calibri" w:cs="Calibri"/>
               <w:color w:val="000000"/>
@@ -2684,7 +3840,7 @@
             <w:autoSpaceDE w:val="0"/>
             <w:autoSpaceDN w:val="0"/>
             <w:ind w:hanging="480"/>
-            <w:divId w:val="2116556142"/>
+            <w:divId w:val="1223835747"/>
             <w:rPr>
               <w:rFonts w:ascii="Calibri" w:eastAsia="Times New Roman" w:hAnsi="Calibri" w:cs="Calibri"/>
               <w:color w:val="000000"/>
@@ -2871,7 +4027,7 @@
             <w:autoSpaceDE w:val="0"/>
             <w:autoSpaceDN w:val="0"/>
             <w:ind w:hanging="480"/>
-            <w:divId w:val="1043601543"/>
+            <w:divId w:val="751656243"/>
             <w:rPr>
               <w:rFonts w:ascii="Calibri" w:eastAsia="Times New Roman" w:hAnsi="Calibri" w:cs="Calibri"/>
               <w:color w:val="000000"/>
@@ -3116,7 +4272,7 @@
             <w:autoSpaceDE w:val="0"/>
             <w:autoSpaceDN w:val="0"/>
             <w:ind w:hanging="480"/>
-            <w:divId w:val="1480264367"/>
+            <w:divId w:val="1485705397"/>
             <w:rPr>
               <w:rFonts w:ascii="Calibri" w:eastAsia="Times New Roman" w:hAnsi="Calibri" w:cs="Calibri"/>
               <w:color w:val="000000"/>
@@ -3462,7 +4618,7 @@
             <w:autoSpaceDE w:val="0"/>
             <w:autoSpaceDN w:val="0"/>
             <w:ind w:hanging="480"/>
-            <w:divId w:val="1492066000"/>
+            <w:divId w:val="1700663970"/>
             <w:rPr>
               <w:rFonts w:ascii="Calibri" w:eastAsia="Times New Roman" w:hAnsi="Calibri" w:cs="Calibri"/>
               <w:color w:val="000000"/>
@@ -3661,7 +4817,7 @@
       </w:sdtContent>
     </w:sdt>
     <w:sectPr>
-      <w:footerReference w:type="default" r:id="rId7"/>
+      <w:footerReference w:type="default" r:id="rId8"/>
       <w:pgSz w:w="11906" w:h="16838"/>
       <w:pgMar w:top="1417" w:right="1417" w:bottom="1417" w:left="1417" w:header="708" w:footer="708" w:gutter="0"/>
       <w:cols w:space="708"/>
@@ -3765,6 +4921,127 @@
     </w:p>
   </w:footnote>
 </w:footnotes>
+</file>
+
+<file path=word/numbering.xml><?xml version="1.0" encoding="utf-8"?>
+<w:numbering xmlns:wpc="http://schemas.microsoft.com/office/word/2010/wordprocessingCanvas" xmlns:cx="http://schemas.microsoft.com/office/drawing/2014/chartex" xmlns:cx1="http://schemas.microsoft.com/office/drawing/2015/9/8/chartex" xmlns:cx2="http://schemas.microsoft.com/office/drawing/2015/10/21/chartex" xmlns:cx3="http://schemas.microsoft.com/office/drawing/2016/5/9/chartex" xmlns:cx4="http://schemas.microsoft.com/office/drawing/2016/5/10/chartex" xmlns:cx5="http://schemas.microsoft.com/office/drawing/2016/5/11/chartex" xmlns:cx6="http://schemas.microsoft.com/office/drawing/2016/5/12/chartex" xmlns:cx7="http://schemas.microsoft.com/office/drawing/2016/5/13/chartex" xmlns:cx8="http://schemas.microsoft.com/office/drawing/2016/5/14/chartex" xmlns:mc="http://schemas.openxmlformats.org/markup-compatibility/2006" xmlns:aink="http://schemas.microsoft.com/office/drawing/2016/ink" xmlns:am3d="http://schemas.microsoft.com/office/drawing/2017/model3d" xmlns:o="urn:schemas-microsoft-com:office:office" xmlns:oel="http://schemas.microsoft.com/office/2019/extlst" xmlns:r="http://schemas.openxmlformats.org/officeDocument/2006/relationships" xmlns:m="http://schemas.openxmlformats.org/officeDocument/2006/math" xmlns:v="urn:schemas-microsoft-com:vml" xmlns:wp14="http://schemas.microsoft.com/office/word/2010/wordprocessingDrawing" xmlns:wp="http://schemas.openxmlformats.org/drawingml/2006/wordprocessingDrawing" xmlns:w10="urn:schemas-microsoft-com:office:word" xmlns:w="http://schemas.openxmlformats.org/wordprocessingml/2006/main" xmlns:w14="http://schemas.microsoft.com/office/word/2010/wordml" xmlns:w15="http://schemas.microsoft.com/office/word/2012/wordml" xmlns:w16cex="http://schemas.microsoft.com/office/word/2018/wordml/cex" xmlns:w16cid="http://schemas.microsoft.com/office/word/2016/wordml/cid" xmlns:w16="http://schemas.microsoft.com/office/word/2018/wordml" xmlns:w16du="http://schemas.microsoft.com/office/word/2023/wordml/word16du" xmlns:w16sdtdh="http://schemas.microsoft.com/office/word/2020/wordml/sdtdatahash" xmlns:w16sdtfl="http://schemas.microsoft.com/office/word/2024/wordml/sdtformatlock" xmlns:w16se="http://schemas.microsoft.com/office/word/2015/wordml/symex" xmlns:wpg="http://schemas.microsoft.com/office/word/2010/wordprocessingGroup" xmlns:wpi="http://schemas.microsoft.com/office/word/2010/wordprocessingInk" xmlns:wne="http://schemas.microsoft.com/office/word/2006/wordml" xmlns:wps="http://schemas.microsoft.com/office/word/2010/wordprocessingShape" mc:Ignorable="w14 w15 w16se w16cid w16 w16cex w16sdtdh w16sdtfl w16du wp14">
+  <w:abstractNum w:abstractNumId="0" w15:restartNumberingAfterBreak="0">
+    <w:nsid w:val="73C818C3"/>
+    <w:multiLevelType w:val="hybridMultilevel"/>
+    <w:tmpl w:val="2BF4A8AA"/>
+    <w:lvl w:ilvl="0" w:tplc="041B0005">
+      <w:start w:val="1"/>
+      <w:numFmt w:val="bullet"/>
+      <w:lvlText w:val=""/>
+      <w:lvlJc w:val="left"/>
+      <w:pPr>
+        <w:ind w:left="720" w:hanging="360"/>
+      </w:pPr>
+      <w:rPr>
+        <w:rFonts w:ascii="Wingdings" w:hAnsi="Wingdings" w:hint="default"/>
+      </w:rPr>
+    </w:lvl>
+    <w:lvl w:ilvl="1" w:tplc="041B0003" w:tentative="1">
+      <w:start w:val="1"/>
+      <w:numFmt w:val="bullet"/>
+      <w:lvlText w:val="o"/>
+      <w:lvlJc w:val="left"/>
+      <w:pPr>
+        <w:ind w:left="1440" w:hanging="360"/>
+      </w:pPr>
+      <w:rPr>
+        <w:rFonts w:ascii="Courier New" w:hAnsi="Courier New" w:cs="Courier New" w:hint="default"/>
+      </w:rPr>
+    </w:lvl>
+    <w:lvl w:ilvl="2" w:tplc="041B0005" w:tentative="1">
+      <w:start w:val="1"/>
+      <w:numFmt w:val="bullet"/>
+      <w:lvlText w:val=""/>
+      <w:lvlJc w:val="left"/>
+      <w:pPr>
+        <w:ind w:left="2160" w:hanging="360"/>
+      </w:pPr>
+      <w:rPr>
+        <w:rFonts w:ascii="Wingdings" w:hAnsi="Wingdings" w:hint="default"/>
+      </w:rPr>
+    </w:lvl>
+    <w:lvl w:ilvl="3" w:tplc="041B0001" w:tentative="1">
+      <w:start w:val="1"/>
+      <w:numFmt w:val="bullet"/>
+      <w:lvlText w:val=""/>
+      <w:lvlJc w:val="left"/>
+      <w:pPr>
+        <w:ind w:left="2880" w:hanging="360"/>
+      </w:pPr>
+      <w:rPr>
+        <w:rFonts w:ascii="Symbol" w:hAnsi="Symbol" w:hint="default"/>
+      </w:rPr>
+    </w:lvl>
+    <w:lvl w:ilvl="4" w:tplc="041B0003" w:tentative="1">
+      <w:start w:val="1"/>
+      <w:numFmt w:val="bullet"/>
+      <w:lvlText w:val="o"/>
+      <w:lvlJc w:val="left"/>
+      <w:pPr>
+        <w:ind w:left="3600" w:hanging="360"/>
+      </w:pPr>
+      <w:rPr>
+        <w:rFonts w:ascii="Courier New" w:hAnsi="Courier New" w:cs="Courier New" w:hint="default"/>
+      </w:rPr>
+    </w:lvl>
+    <w:lvl w:ilvl="5" w:tplc="041B0005" w:tentative="1">
+      <w:start w:val="1"/>
+      <w:numFmt w:val="bullet"/>
+      <w:lvlText w:val=""/>
+      <w:lvlJc w:val="left"/>
+      <w:pPr>
+        <w:ind w:left="4320" w:hanging="360"/>
+      </w:pPr>
+      <w:rPr>
+        <w:rFonts w:ascii="Wingdings" w:hAnsi="Wingdings" w:hint="default"/>
+      </w:rPr>
+    </w:lvl>
+    <w:lvl w:ilvl="6" w:tplc="041B0001" w:tentative="1">
+      <w:start w:val="1"/>
+      <w:numFmt w:val="bullet"/>
+      <w:lvlText w:val=""/>
+      <w:lvlJc w:val="left"/>
+      <w:pPr>
+        <w:ind w:left="5040" w:hanging="360"/>
+      </w:pPr>
+      <w:rPr>
+        <w:rFonts w:ascii="Symbol" w:hAnsi="Symbol" w:hint="default"/>
+      </w:rPr>
+    </w:lvl>
+    <w:lvl w:ilvl="7" w:tplc="041B0003" w:tentative="1">
+      <w:start w:val="1"/>
+      <w:numFmt w:val="bullet"/>
+      <w:lvlText w:val="o"/>
+      <w:lvlJc w:val="left"/>
+      <w:pPr>
+        <w:ind w:left="5760" w:hanging="360"/>
+      </w:pPr>
+      <w:rPr>
+        <w:rFonts w:ascii="Courier New" w:hAnsi="Courier New" w:cs="Courier New" w:hint="default"/>
+      </w:rPr>
+    </w:lvl>
+    <w:lvl w:ilvl="8" w:tplc="041B0005" w:tentative="1">
+      <w:start w:val="1"/>
+      <w:numFmt w:val="bullet"/>
+      <w:lvlText w:val=""/>
+      <w:lvlJc w:val="left"/>
+      <w:pPr>
+        <w:ind w:left="6480" w:hanging="360"/>
+      </w:pPr>
+      <w:rPr>
+        <w:rFonts w:ascii="Wingdings" w:hAnsi="Wingdings" w:hint="default"/>
+      </w:rPr>
+    </w:lvl>
+  </w:abstractNum>
+  <w:num w:numId="1" w16cid:durableId="1657874310">
+    <w:abstractNumId w:val="0"/>
+  </w:num>
+</w:numbering>
 </file>
 
 <file path=word/styles.xml><?xml version="1.0" encoding="utf-8"?>
@@ -4805,12 +6082,12 @@
 
 <file path=word/glossary/fontTable.xml><?xml version="1.0" encoding="utf-8"?>
 <w:fonts xmlns:mc="http://schemas.openxmlformats.org/markup-compatibility/2006" xmlns:r="http://schemas.openxmlformats.org/officeDocument/2006/relationships" xmlns:w="http://schemas.openxmlformats.org/wordprocessingml/2006/main" xmlns:w14="http://schemas.microsoft.com/office/word/2010/wordml" xmlns:w15="http://schemas.microsoft.com/office/word/2012/wordml" xmlns:w16cex="http://schemas.microsoft.com/office/word/2018/wordml/cex" xmlns:w16cid="http://schemas.microsoft.com/office/word/2016/wordml/cid" xmlns:w16="http://schemas.microsoft.com/office/word/2018/wordml" xmlns:w16du="http://schemas.microsoft.com/office/word/2023/wordml/word16du" xmlns:w16sdtdh="http://schemas.microsoft.com/office/word/2020/wordml/sdtdatahash" xmlns:w16sdtfl="http://schemas.microsoft.com/office/word/2024/wordml/sdtformatlock" xmlns:w16se="http://schemas.microsoft.com/office/word/2015/wordml/symex" mc:Ignorable="w14 w15 w16se w16cid w16 w16cex w16sdtdh w16sdtfl w16du">
-  <w:font w:name="Calibri">
-    <w:panose1 w:val="020F0502020204030204"/>
-    <w:charset w:val="EE"/>
-    <w:family w:val="swiss"/>
+  <w:font w:name="Wingdings">
+    <w:panose1 w:val="05000000000000000000"/>
+    <w:charset w:val="02"/>
+    <w:family w:val="auto"/>
     <w:pitch w:val="variable"/>
-    <w:sig w:usb0="E4002EFF" w:usb1="C200247B" w:usb2="00000009" w:usb3="00000000" w:csb0="000001FF" w:csb1="00000000"/>
+    <w:sig w:usb0="00000000" w:usb1="10000000" w:usb2="00000000" w:usb3="00000000" w:csb0="80000000" w:csb1="00000000"/>
   </w:font>
   <w:font w:name="Times New Roman">
     <w:panose1 w:val="02020603050405020304"/>
@@ -4818,6 +6095,27 @@
     <w:family w:val="roman"/>
     <w:pitch w:val="variable"/>
     <w:sig w:usb0="E0002EFF" w:usb1="C000785B" w:usb2="00000009" w:usb3="00000000" w:csb0="000001FF" w:csb1="00000000"/>
+  </w:font>
+  <w:font w:name="Courier New">
+    <w:panose1 w:val="02070309020205020404"/>
+    <w:charset w:val="00"/>
+    <w:family w:val="modern"/>
+    <w:pitch w:val="fixed"/>
+    <w:sig w:usb0="E0002EFF" w:usb1="C0007843" w:usb2="00000009" w:usb3="00000000" w:csb0="000001FF" w:csb1="00000000"/>
+  </w:font>
+  <w:font w:name="Symbol">
+    <w:panose1 w:val="05050102010706020507"/>
+    <w:charset w:val="02"/>
+    <w:family w:val="roman"/>
+    <w:pitch w:val="variable"/>
+    <w:sig w:usb0="00000000" w:usb1="10000000" w:usb2="00000000" w:usb3="00000000" w:csb0="80000000" w:csb1="00000000"/>
+  </w:font>
+  <w:font w:name="Calibri">
+    <w:panose1 w:val="020F0502020204030204"/>
+    <w:charset w:val="EE"/>
+    <w:family w:val="swiss"/>
+    <w:pitch w:val="variable"/>
+    <w:sig w:usb0="E4002EFF" w:usb1="C200247B" w:usb2="00000009" w:usb3="00000000" w:csb0="000001FF" w:csb1="00000000"/>
   </w:font>
   <w:font w:name="Calibri Light">
     <w:panose1 w:val="020F0302020204030204"/>
@@ -4858,12 +6156,20 @@
   </w:compat>
   <w:rsids>
     <w:rsidRoot w:val="00EF1F3F"/>
+    <w:rsid w:val="00046425"/>
+    <w:rsid w:val="004C6F8F"/>
     <w:rsid w:val="005E5AC4"/>
     <w:rsid w:val="00723C5C"/>
+    <w:rsid w:val="00756B9A"/>
     <w:rsid w:val="00767F00"/>
+    <w:rsid w:val="007A39C4"/>
+    <w:rsid w:val="00962B2B"/>
     <w:rsid w:val="00C40CF8"/>
+    <w:rsid w:val="00C70E60"/>
+    <w:rsid w:val="00D47CFF"/>
     <w:rsid w:val="00E75429"/>
     <w:rsid w:val="00EF1F3F"/>
+    <w:rsid w:val="00F77B79"/>
   </w:rsids>
   <m:mathPr>
     <m:mathFont m:val="Cambria Math"/>
@@ -5649,7 +6955,7 @@
   </we:alternateReferences>
   <we:properties>
     <we:property name="MENDELEY_BIBLIOGRAPHY_IS_DIRTY" value="false"/>
-    <we:property name="MENDELEY_BIBLIOGRAPHY_LAST_MODIFIED" value="1779895292830"/>
+    <we:property name="MENDELEY_BIBLIOGRAPHY_LAST_MODIFIED" value="1779974744604"/>
     <we:property name="MENDELEY_CITATIONS" value="[{&quot;citationID&quot;:&quot;MENDELEY_CITATION_d6f0c2a8-d5ec-468c-a71e-e21c358f2787&quot;,&quot;properties&quot;:{&quot;noteIndex&quot;:0},&quot;isEdited&quot;:false,&quot;manualOverride&quot;:{&quot;isManuallyOverridden&quot;:false,&quot;citeprocText&quot;:&quot;(Kılıç, 2025)&quot;,&quot;manualOverrideText&quot;:&quot;&quot;},&quot;citationTag&quot;:&quot;MENDELEY_CITATION_v3_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&quot;,&quot;citationItems&quot;:[{&quot;id&quot;:&quot;90fb3a2a-8a8b-3dca-be16-1ec0c8795603&quot;,&quot;itemData&quot;:{&quot;type&quot;:&quot;article-journal&quot;,&quot;id&quot;:&quot;90fb3a2a-8a8b-3dca-be16-1ec0c8795603&quot;,&quot;title&quot;:&quot;Linear and nonlinear econometric models against machine learning models: realized volatility prediction&quot;,&quot;groupId&quot;:&quot;092e372d-c067-3fdb-b3f7-8bafafb41bf5&quot;,&quot;author&quot;:[{&quot;family&quot;:&quot;Kılıç&quot;,&quot;given&quot;:&quot;Rehim&quot;,&quot;parse-names&quot;:false,&quot;dropping-particle&quot;:&quot;&quot;,&quot;non-dropping-particle&quot;:&quot;&quot;}],&quot;accessed&quot;:{&quot;date-parts&quot;:[[2026,5,26]]},&quot;DOI&quot;:&quot;10.17016/FEDS.2025.061&quot;,&quot;ISSN&quot;:&quot;2767-3898&quot;,&quot;URL&quot;:&quot;https://doi.org/10.17016/FEDS.2025.061.&quot;,&quot;issued&quot;:{&quot;date-parts&quot;:[[2025]]},&quot;abstract&quot;:&quot;This paper fills an important gap in the volatility forecasting literature by comparing a broad suite of machine learning (ML) methods with both linear and nonlinear econo-metric models using high-frequency realized volatility (RV) data for the S&amp;P 500. We evaluate ARFIMA, HAR, regime-switching HAR models (THAR, STHAR, MSHAR), and ML methods including Extreme Gradient Boosting, deep feed-forward neural networks, and recurrent networks (BRNN, LSTM, LSTM-A, GRU). Using rolling forecasts from 2006 onward , we find that regime-switching models-particularly THAR and STHAR-consistently outperform ML and linear models, especially when predictors are limited. These models also deliver more accurate risk forecasts and higher realized utility. While ML models capture some nonlinear patterns, they offer no consistent advantage over simpler, interpretable alternatives. Our findings highlight the importance of modeling regime changes through transparent econometric tools, especially in real-world applications where predictor availability is sparse and model interpretability is critical for risk management and portfolio allocation. JEL Classification: C10, C50, G11, G15.&quot;},&quot;isTemporary&quot;:false}]},{&quot;citationID&quot;:&quot;MENDELEY_CITATION_ea9f8a8f-fb80-4741-b592-b7ea38361fcb&quot;,&quot;properties&quot;:{&quot;noteIndex&quot;:0},&quot;isEdited&quot;:false,&quot;manualOverride&quot;:{&quot;isManuallyOverridden&quot;:false,&quot;citeprocText&quot;:&quot;(Leushuis &amp;#38; Petkov, 2026)&quot;,&quot;manualOverrideText&quot;:&quot;&quot;},&quot;citationTag&quot;:&quot;MENDELEY_CITATION_v3_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&quot;,&quot;citationItems&quot;:[{&quot;id&quot;:&quot;02d76dd6-27f2-376c-9de7-1e3428a31074&quot;,&quot;itemData&quot;:{&quot;type&quot;:&quot;article-journal&quot;,&quot;id&quot;:&quot;02d76dd6-27f2-376c-9de7-1e3428a31074&quot;,&quot;title&quot;:&quot;Advances in forecasting realized volatility: a review of methodologies&quot;,&quot;groupId&quot;:&quot;092e372d-c067-3fdb-b3f7-8bafafb41bf5&quot;,&quot;author&quot;:[{&quot;family&quot;:&quot;Leushuis&quot;,&quot;given&quot;:&quot;Radmir Mishelevich&quot;,&quot;parse-names&quot;:false,&quot;dropping-particle&quot;:&quot;&quot;,&quot;non-dropping-particle&quot;:&quot;&quot;},{&quot;family&quot;:&quot;Petkov&quot;,&quot;given&quot;:&quot;Nicolai&quot;,&quot;parse-names&quot;:false,&quot;dropping-particle&quot;:&quot;&quot;,&quot;non-dropping-particle&quot;:&quot;&quot;}],&quot;container-title&quot;:&quot;Financial Innovation 2026 12:1&quot;,&quot;accessed&quot;:{&quot;date-parts&quot;:[[2026,5,26]]},&quot;DOI&quot;:&quot;10.1186/S40854-025-00809-5&quot;,&quot;ISSN&quot;:&quot;2199-4730&quot;,&quot;URL&quot;:&quot;https://link.springer.com/article/10.1186/s40854-025-00809-5&quot;,&quot;issued&quot;:{&quot;date-parts&quot;:[[2026,1,6]]},&quot;page&quot;:&quot;14-&quot;,&quot;abstract&quot;:&quot;Over the past decade, volatility modeling has gained increasing importance in quantitative finance, significantly influencing risk management, investment strategies, and policymaking. Traditionally, academic research has emphasized linear models for forecasting realized volatility. However, advances in computational power have enabled the development of more sophisticated approaches, including machine and deep learning models. Despite these advancements, no comprehensive survey currently compares traditional linear methods with newer models in the context of realized volatility forecasting. This survey addresses that gap by analyzing all models used to forecast realized volatility in academic literature from 2000 to the first half of 2024. It highlights key academic contributions and examines the empirical characteristics of realized volatility. Our findings indicate that the top-performing hybrid convolutional neural network and long short-term memory model surpasses other models in forecasting accuracy. These results highlight the ability of such models to capture a broader range of factors driving realized volatility, affirming their valuable role in quantitative modeling.&quot;,&quot;publisher&quot;:&quot;SpringerOpen&quot;,&quot;issue&quot;:&quot;1&quot;,&quot;volume&quot;:&quot;12&quot;},&quot;isTemporary&quot;:false}]},{&quot;citationID&quot;:&quot;MENDELEY_CITATION_0f95b632-cf94-4bc1-b504-eb48f89c7649&quot;,&quot;properties&quot;:{&quot;noteIndex&quot;:0},&quot;isEdited&quot;:false,&quot;manualOverride&quot;:{&quot;isManuallyOverridden&quot;:false,&quot;citeprocText&quot;:&quot;(Peter et al., 2026)&quot;,&quot;manualOverrideText&quot;:&quot;&quot;},&quot;citationTag&quot;:&quot;MENDELEY_CITATION_v3_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&quot;,&quot;citationItems&quot;:[{&quot;id&quot;:&quot;99e7fb6e-624b-3146-ae51-dc6c98478710&quot;,&quot;itemData&quot;:{&quot;type&quot;:&quot;article-journal&quot;,&quot;id&quot;:&quot;99e7fb6e-624b-3146-ae51-dc6c98478710&quot;,&quot;title&quot;:&quot;A stacking model integrating GARCH and LSTM with feature interactions for time series volatility prediction&quot;,&quot;groupId&quot;:&quot;092e372d-c067-3fdb-b3f7-8bafafb41bf5&quot;,&quot;author&quot;:[{&quot;family&quot;:&quot;Peter&quot;,&quot;given&quot;:&quot;Michael&quot;,&quot;parse-names&quot;:false,&quot;dropping-particle&quot;:&quot;&quot;,&quot;non-dropping-particle&quot;:&quot;&quot;},{&quot;family&quot;:&quot;Mirau&quot;,&quot;given&quot;:&quot;Silas&quot;,&quot;parse-names&quot;:false,&quot;dropping-particle&quot;:&quot;&quot;,&quot;non-dropping-particle&quot;:&quot;&quot;},{&quot;family&quot;:&quot;Sinkwembe&quot;,&quot;given&quot;:&quot;Emmanuel&quot;,&quot;parse-names&quot;:false,&quot;dropping-particle&quot;:&quot;&quot;,&quot;non-dropping-particle&quot;:&quot;&quot;},{&quot;family&quot;:&quot;Kasumo&quot;,&quot;given&quot;:&quot;Christian&quot;,&quot;parse-names&quot;:false,&quot;dropping-particle&quot;:&quot;&quot;,&quot;non-dropping-particle&quot;:&quot;&quot;},{&quot;family&quot;:&quot;Guambe&quot;,&quot;given&quot;:&quot;Calisto&quot;,&quot;parse-names&quot;:false,&quot;dropping-particle&quot;:&quot;&quot;,&quot;non-dropping-particle&quot;:&quot;&quot;}],&quot;container-title&quot;:&quot;Array&quot;,&quot;accessed&quot;:{&quot;date-parts&quot;:[[2026,5,26]]},&quot;DOI&quot;:&quot;10.1016/J.ARRAY.2026.100700&quot;,&quot;ISSN&quot;:&quot;2590-0056&quot;,&quot;URL&quot;:&quot;https://www.sciencedirect.com/science/article/pii/S2590005626000238&quot;,&quot;issued&quot;:{&quot;date-parts&quot;:[[2026,3,1]]},&quot;page&quot;:&quot;100700&quot;,&quot;abstract&quot;:&quot;Volatility forecasting remains a cornerstone of quantitative finance, underpinning risk management, portfolio optimization, and regulatory oversight. This study introduces a novel stacking model that integrates the generalized autoregressive conditional heteroskedasticity (GARCH) framework with long short-term memory (LSTM) networks to capture both econometric structure and nonlinear temporal dependencies in financial time series. Unlike conventional hybrid approaches that sequentially cascade outputs, the proposed framework employs GARCH and LSTM as parallel base learners, with their predictions intelligently fused through a meta-learner that exploits feature interactions and cross-model synergies. The empirical evaluation benchmarks the stacking ensemble against state-of-the-art alternatives, including DLINEAR, CKAN, N-BEATS, and individual GARCH and LSTM specifications across multiple performance metrics. Results demonstrate consistent superiority across RMSE, MAE, accuracy, RAMP, geometric mean, Hausdorff distance, and AUC metrics, validating the synergistic benefits of integrating econometric and machine learning paradigms within a theoretically grounded architecture. The model's superior performance stems from leveraging GARCH's parametric efficiency in modeling volatility clustering while harnessing LSTM's capacity to capture complex nonlinear temporal patterns. Beyond methodological contributions, the framework offers practical value for enhancing systemic risk monitoring, improving stress testing frameworks, and optimizing investment strategies across diverse market conditions. The demonstrated robustness across different market regimes underscores its potential for adoption in both routine operations and crisis contexts. This research establishes stacking-based ensemble modeling as a powerful paradigm for advancing volatility prediction and provides a foundation for next-generation financial forecasting systems.&quot;,&quot;publisher&quot;:&quot;Elsevier&quot;,&quot;volume&quot;:&quot;29&quot;},&quot;isTemporary&quot;:false}]},{&quot;citationID&quot;:&quot;MENDELEY_CITATION_f970d8fa-1c6f-4763-a6bc-d806631e65d3&quot;,&quot;properties&quot;:{&quot;noteIndex&quot;:0},&quot;isEdited&quot;:false,&quot;manualOverride&quot;:{&quot;isManuallyOverridden&quot;:false,&quot;citeprocText&quot;:&quot;(Khan et al., 2024)&quot;,&quot;manualOverrideText&quot;:&quot;&quot;},&quot;citationTag&quot;:&quot;MENDELEY_CITATION_v3_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&quot;,&quot;citationItems&quot;:[{&quot;id&quot;:&quot;ee25369a-392d-3ddd-b970-56027ef8f602&quot;,&quot;itemData&quot;:{&quot;type&quot;:&quot;article-journal&quot;,&quot;id&quot;:&quot;ee25369a-392d-3ddd-b970-56027ef8f602&quot;,&quot;title&quot;:&quot;The impact of the COVID 19 pandemic on stock market volatility: evidence from a selection of developed and emerging stock markets&quot;,&quot;groupId&quot;:&quot;092e372d-c067-3fdb-b3f7-8bafafb41bf5&quot;,&quot;author&quot;:[{&quot;family&quot;:&quot;Khan&quot;,&quot;given&quot;:&quot;Muhammad Niaz&quot;,&quot;parse-names&quot;:false,&quot;dropping-particle&quot;:&quot;&quot;,&quot;non-dropping-particle&quot;:&quot;&quot;},{&quot;family&quot;:&quot;Fifield&quot;,&quot;given&quot;:&quot;Suzanne G.M.&quot;,&quot;parse-names&quot;:false,&quot;dropping-particle&quot;:&quot;&quot;,&quot;non-dropping-particle&quot;:&quot;&quot;},{&quot;family&quot;:&quot;Power&quot;,&quot;given&quot;:&quot;David M.&quot;,&quot;parse-names&quot;:false,&quot;dropping-particle&quot;:&quot;&quot;,&quot;non-dropping-particle&quot;:&quot;&quot;}],&quot;container-title&quot;:&quot;SN Business &amp; Economics 2024 4:6&quot;,&quot;accessed&quot;:{&quot;date-parts&quot;:[[2026,5,26]]},&quot;DOI&quot;:&quot;10.1007/S43546-024-00659-W&quot;,&quot;ISBN&quot;:&quot;0123456789&quot;,&quot;ISSN&quot;:&quot;2662-9399&quot;,&quot;URL&quot;:&quot;https://link.springer.com/article/10.1007/s43546-024-00659-w&quot;,&quot;issued&quot;:{&quot;date-parts&quot;:[[2024,5,15]]},&quot;page&quot;:&quot;63-&quot;,&quot;abstract&quot;:&quot;This study examines the impact of the COVID 19 pandemic on the stock markets of China, India, Pakistan, the UK and the US using Generalised Autoregressive Conditional Heteroscedasticity (GARCH) and Threshold GARCH models with COVID 19 as an exogenous dummy variable in the variance equation. The sample period of 2016–2021 is divided into two sub-periods: the pre-COVID 19 period and the COVID 19 period. The results of the study indicate that there was persistent volatility in these markets and that this volatility increased as a result of the pandemic. In addition, the Threshold GARCH results indicate that the asymmetric term was significant in all markets indicating that bad news, such as the pandemic, had a stronger impact on the conditional variance of the returns as compared to good news. In addition, the results further confirm that the US market had no significant impact on the volatility of the Chinese market during the pandemic. The results have important implications for (1) international investors regarding portfolio management and investment risk minimisation in situations like the COVID 19 pandemic; and (2) policy-makers in terms of how they respond to any future pandemic.&quot;,&quot;publisher&quot;:&quot;Springer&quot;,&quot;issue&quot;:&quot;6&quot;,&quot;volume&quot;:&quot;4&quot;},&quot;isTemporary&quot;:false}]},{&quot;citationID&quot;:&quot;MENDELEY_CITATION_93754582-a1be-42bd-b605-1107039d5487&quot;,&quot;properties&quot;:{&quot;noteIndex&quot;:0},&quot;isEdited&quot;:false,&quot;manualOverride&quot;:{&quot;isManuallyOverridden&quot;:false,&quot;citeprocText&quot;:&quot;(Vuong et al., 2022)&quot;,&quot;manualOverrideText&quot;:&quot;&quot;},&quot;citationTag&quot;:&quot;MENDELEY_CITATION_v3_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&quot;,&quot;citationItems&quot;:[{&quot;id&quot;:&quot;df765be2-c18e-3246-bc42-c0014b3b1f22&quot;,&quot;itemData&quot;:{&quot;type&quot;:&quot;article-journal&quot;,&quot;id&quot;:&quot;df765be2-c18e-3246-bc42-c0014b3b1f22&quot;,&quot;title&quot;:&quot;Volatility spillovers from the Chinese stock market to the U.S. stock market: The role of the COVID-19 pandemic&quot;,&quot;groupId&quot;:&quot;092e372d-c067-3fdb-b3f7-8bafafb41bf5&quot;,&quot;author&quot;:[{&quot;family&quot;:&quot;Vuong&quot;,&quot;given&quot;:&quot;Giang Thi Huong&quot;,&quot;parse-names&quot;:false,&quot;dropping-particle&quot;:&quot;&quot;,&quot;non-dropping-particle&quot;:&quot;&quot;},{&quot;family&quot;:&quot;Nguyen&quot;,&quot;given&quot;:&quot;Manh Huu&quot;,&quot;parse-names&quot;:false,&quot;dropping-particle&quot;:&quot;&quot;,&quot;non-dropping-particle&quot;:&quot;&quot;},{&quot;family&quot;:&quot;Huynh&quot;,&quot;given&quot;:&quot;Anh Ngoc Quang&quot;,&quot;parse-names&quot;:false,&quot;dropping-particle&quot;:&quot;&quot;,&quot;non-dropping-particle&quot;:&quot;&quot;}],&quot;container-title&quot;:&quot;The Journal of Economic Asymmetries&quot;,&quot;accessed&quot;:{&quot;date-parts&quot;:[[2026,5,26]]},&quot;DOI&quot;:&quot;10.1016/J.JECA.2022.E00276&quot;,&quot;ISSN&quot;:&quot;1703-4949&quot;,&quot;URL&quot;:&quot;https://www.sciencedirect.com/science/article/pii/S1703494922000366&quot;,&quot;issued&quot;:{&quot;date-parts&quot;:[[2022,11,1]]},&quot;page&quot;:&quot;e00276&quot;,&quot;abstract&quot;:&quot;The COVID-19 pandemic, which originated in Wuhan, China, precipitated the stock market crash of March 2020. According to published global data, the U.S. has been most affected by the tragedy throughout this outbreak. Understanding the degree of integration between the financial systems of the world's two largest economies, particularly during the COVID-19 pandemic, necessitates thorough research of the risk transmission from China's stock market to the U.S. stock market. This study examines the volatility transmission from the Chinese to the U.S. stock market from January 2001 to October 2020. We employ a variant form of the EGARCH (1,1) model with long-term control over the excessive volatility breakpoints identified by the ICSS algorithm. Since 2004, empirical evidence indicates that the volatility shocks of the Chinese stock market have frequently and negatively affected the volatility of the U.S. stock market. Most importantly, we explore that the COVID-19 pandemic vigorously and positively promoted the volatility infection from the Chinese equity market to the U.S. equity market in March 2020. This precious evidence endorses the asymmetric volatility transmission from the Chinese to the U.S. stock market when COVID-19 broke out. These experimental results provide profound insight into the risk contagion between the U.S. and China stock markets. They are also essential for securities investors to minimize portfolio risk. Furthermore, this paper suggests that globalization has carefully driven the integration of China's stock market with the international equity markets.&quot;,&quot;publisher&quot;:&quot;Elsevier&quot;,&quot;volume&quot;:&quot;26&quot;},&quot;isTemporary&quot;:false}]},{&quot;citationID&quot;:&quot;MENDELEY_CITATION_97ee10ab-13bb-40a0-b6c9-d341d2c446da&quot;,&quot;properties&quot;:{&quot;noteIndex&quot;:0},&quot;isEdited&quot;:false,&quot;manualOverride&quot;:{&quot;isManuallyOverridden&quot;:false,&quot;citeprocText&quot;:&quot;(Wang, 2024)&quot;,&quot;manualOverrideText&quot;:&quot;&quot;},&quot;citationTag&quot;:&quot;MENDELEY_CITATION_v3_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&quot;,&quot;citationItems&quot;:[{&quot;id&quot;:&quot;522db720-d412-31e1-a762-d59d545649ea&quot;,&quot;itemData&quot;:{&quot;type&quot;:&quot;article-journal&quot;,&quot;id&quot;:&quot;522db720-d412-31e1-a762-d59d545649ea&quot;,&quot;title&quot;:&quot;The Relationship Between Geopolitical Risks and Stock Market Volatility&quot;,&quot;groupId&quot;:&quot;092e372d-c067-3fdb-b3f7-8bafafb41bf5&quot;,&quot;author&quot;:[{&quot;family&quot;:&quot;Wang&quot;,&quot;given&quot;:&quot;Yuanxin&quot;,&quot;parse-names&quot;:false,&quot;dropping-particle&quot;:&quot;&quot;,&quot;non-dropping-particle&quot;:&quot;&quot;}],&quot;container-title&quot;:&quot;Frontiers in Business, Economics and Management&quot;,&quot;accessed&quot;:{&quot;date-parts&quot;:[[2026,5,26]]},&quot;DOI&quot;:&quot;10.54097/VTXP2W40&quot;,&quot;ISSN&quot;:&quot;2766-824X&quot;,&quot;issued&quot;:{&quot;date-parts&quot;:[[2024,12,24]]},&quot;page&quot;:&quot;379-385&quot;,&quot;abstract&quot;:&quot;In the globalized economic system, geopolitical conflicts are increasingly prominent as an important factor affecting stock market volatility. This essay delve into deeply explore the complex relationship between geopolitical risks and stock market volatility, and comprehensively analyze this area from a macro perspective through the combination of theory and empirical methods. First, this essay defines geopolitical risks systematically and explores various sources. Further, this essay analyzes the broad impact of geopolitical risks on the global economy and economic financial system. With regard to the stock market volatility, this essay introduces the measurement method of stock market volatility. In order to fully understand the impact of geopolitical risks on the stock market volatility, this essay conducts deep analysis from two dimensions of market sentiment and capital flows. In order to more specifically illustrate the impact of geopolitical risks on stock market volatility, this essay conducts an in-depth analysis using the Russian-Ukrainian war as a case study. This case not only shows the direct impact of geopolitical conflicts on stock market volatility, but also reveals the deep economic and financial logic behind it. The research in this paper not only helps to deeply understand the mechanism of the impact of geopolitical risk on stock market volatility, but also provides a useful reference for investors and policy makers. In the face of geopolitical risks, investors should pay more attention to relevant information in order to make more informed investment decisions. Policy makers should strengthen real-time monitoring of geopolitical risks and take corresponding risk prevention measures to maintain the stability of financial markets.&quot;,&quot;publisher&quot;:&quot;Darcy &amp; Roy Press Co. Ltd.&quot;,&quot;issue&quot;:&quot;3&quot;,&quot;volume&quot;:&quot;17&quot;},&quot;isTemporary&quot;:false}]},{&quot;citationID&quot;:&quot;MENDELEY_CITATION_6c6787bf-a8ae-4dd9-bbc6-2bbaa5422402&quot;,&quot;properties&quot;:{&quot;noteIndex&quot;:0},&quot;isEdited&quot;:false,&quot;manualOverride&quot;:{&quot;isManuallyOverridden&quot;:false,&quot;citeprocText&quot;:&quot;(Branco et al., 2024)&quot;,&quot;manualOverrideText&quot;:&quot;&quot;},&quot;citationTag&quot;:&quot;MENDELEY_CITATION_v3_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&quot;,&quot;citationItems&quot;:[{&quot;id&quot;:&quot;5feadc75-f7f1-3040-a41a-a354532e5302&quot;,&quot;itemData&quot;:{&quot;type&quot;:&quot;article-journal&quot;,&quot;id&quot;:&quot;5feadc75-f7f1-3040-a41a-a354532e5302&quot;,&quot;title&quot;:&quot;Forecasting realized volatility: Does anything beat linear models?&quot;,&quot;groupId&quot;:&quot;092e372d-c067-3fdb-b3f7-8bafafb41bf5&quot;,&quot;author&quot;:[{&quot;family&quot;:&quot;Branco&quot;,&quot;given&quot;:&quot;Rafael R.&quot;,&quot;parse-names&quot;:false,&quot;dropping-particle&quot;:&quot;&quot;,&quot;non-dropping-particle&quot;:&quot;&quot;},{&quot;family&quot;:&quot;Rubesam&quot;,&quot;given&quot;:&quot;Alexandre&quot;,&quot;parse-names&quot;:false,&quot;dropping-particle&quot;:&quot;&quot;,&quot;non-dropping-particle&quot;:&quot;&quot;},{&quot;family&quot;:&quot;Zevallos&quot;,&quot;given&quot;:&quot;Mauricio&quot;,&quot;parse-names&quot;:false,&quot;dropping-particle&quot;:&quot;&quot;,&quot;non-dropping-particle&quot;:&quot;&quot;}],&quot;container-title&quot;:&quot;Journal of Empirical Finance&quot;,&quot;container-title-short&quot;:&quot;J. Empir. Finance&quot;,&quot;accessed&quot;:{&quot;date-parts&quot;:[[2026,5,27]]},&quot;DOI&quot;:&quot;10.1016/j.jempfin.2024.101524&quot;,&quot;ISSN&quot;:&quot;09275398&quot;,&quot;issued&quot;:{&quot;date-parts&quot;:[[2024,9,1]]},&quot;abstract&quot;:&quot;We evaluate the performance of several linear and nonlinear machine learning (ML) models in forecasting the realized volatility (RV) of ten global stock market indices in the period from January 2000 to December 2021. We train models using a dataset that includes past values of the RV and additional predictors, including lagged returns, implied volatility, macroeconomic and sentiment variables. We compare these models to widely used heterogeneous autoregressive (HAR) models. Our main conclusions are that (i) the additional predictors improve the out-of-sample forecasts at the daily and weekly forecast horizons; (ii) we find no evidence that nonlinear ML models can statistically outperform linear models in general; and (iii) in terms of the economic value that an investor would derive from monthly RV forecasts to build volatility-timing portfolios, simpler models without additional predictors work better.&quot;,&quot;publisher&quot;:&quot;Elsevier B.V.&quot;,&quot;volume&quot;:&quot;78&quot;},&quot;isTemporary&quot;:false}]}]"/>
     <we:property name="MENDELEY_CITATIONS_STYLE" value="{&quot;id&quot;:&quot;https://www.zotero.org/styles/apa&quot;,&quot;title&quot;:&quot;APA Style 7th edition&quot;,&quot;format&quot;:&quot;author-date&quot;,&quot;defaultLocale&quot;:null,&quot;isLocaleCodeValid&quot;:true}"/>
   </we:properties>

</xml_diff>

<commit_message>
Prezentácia aneb "How long is this going to take?!"
</commit_message>
<xml_diff>
--- a/Koncept Dizertačnej Práce.docx
+++ b/Koncept Dizertačnej Práce.docx
@@ -228,23 +228,7 @@
           <w:sz w:val="24"/>
           <w:szCs w:val="24"/>
         </w:rPr>
-        <w:t xml:space="preserve"> pri obmedzenom počte </w:t>
-      </w:r>
-      <w:proofErr w:type="spellStart"/>
-      <w:r>
-        <w:rPr>
-          <w:sz w:val="24"/>
-          <w:szCs w:val="24"/>
-        </w:rPr>
-        <w:t>prediktorov</w:t>
-      </w:r>
-      <w:proofErr w:type="spellEnd"/>
-      <w:r>
-        <w:rPr>
-          <w:sz w:val="24"/>
-          <w:szCs w:val="24"/>
-        </w:rPr>
-        <w:t xml:space="preserve"> </w:t>
+        <w:t xml:space="preserve"> pri obmedzenom počte prediktorov </w:t>
       </w:r>
       <w:sdt>
         <w:sdtPr>
@@ -268,27 +252,7 @@
               <w:sz w:val="24"/>
               <w:szCs w:val="24"/>
             </w:rPr>
-            <w:t>(</w:t>
-          </w:r>
-          <w:proofErr w:type="spellStart"/>
-          <w:r>
-            <w:rPr>
-              <w:rFonts w:ascii="Calibri" w:hAnsi="Calibri" w:cs="Calibri"/>
-              <w:color w:val="000000"/>
-              <w:sz w:val="24"/>
-              <w:szCs w:val="24"/>
-            </w:rPr>
-            <w:t>Kılıç</w:t>
-          </w:r>
-          <w:proofErr w:type="spellEnd"/>
-          <w:r>
-            <w:rPr>
-              <w:rFonts w:ascii="Calibri" w:hAnsi="Calibri" w:cs="Calibri"/>
-              <w:color w:val="000000"/>
-              <w:sz w:val="24"/>
-              <w:szCs w:val="24"/>
-            </w:rPr>
-            <w:t>, 2025)</w:t>
+            <w:t>(Kılıç, 2025)</w:t>
           </w:r>
         </w:sdtContent>
       </w:sdt>
@@ -320,23 +284,7 @@
           <w:sz w:val="24"/>
           <w:szCs w:val="24"/>
         </w:rPr>
-        <w:t xml:space="preserve">môžu slúžiť ako zlepšenie, ale tento prístup je vysoko závislý od kvality </w:t>
-      </w:r>
-      <w:proofErr w:type="spellStart"/>
-      <w:r>
-        <w:rPr>
-          <w:sz w:val="24"/>
-          <w:szCs w:val="24"/>
-        </w:rPr>
-        <w:t>prediktorov</w:t>
-      </w:r>
-      <w:proofErr w:type="spellEnd"/>
-      <w:r>
-        <w:rPr>
-          <w:sz w:val="24"/>
-          <w:szCs w:val="24"/>
-        </w:rPr>
-        <w:t xml:space="preserve">. Pri modeloch strojového a hlbokého učenia zostáva limitujúcim faktorom hlavne interpretácia </w:t>
+        <w:t xml:space="preserve">môžu slúžiť ako zlepšenie, ale tento prístup je vysoko závislý od kvality prediktorov. Pri modeloch strojového a hlbokého učenia zostáva limitujúcim faktorom hlavne interpretácia </w:t>
       </w:r>
       <w:sdt>
         <w:sdtPr>
@@ -359,43 +307,7 @@
               <w:color w:val="000000"/>
               <w:sz w:val="24"/>
             </w:rPr>
-            <w:t>(</w:t>
-          </w:r>
-          <w:proofErr w:type="spellStart"/>
-          <w:r>
-            <w:rPr>
-              <w:rFonts w:ascii="Calibri" w:eastAsia="Times New Roman" w:hAnsi="Calibri" w:cs="Calibri"/>
-              <w:color w:val="000000"/>
-              <w:sz w:val="24"/>
-            </w:rPr>
-            <w:t>Leushuis</w:t>
-          </w:r>
-          <w:proofErr w:type="spellEnd"/>
-          <w:r>
-            <w:rPr>
-              <w:rFonts w:ascii="Calibri" w:eastAsia="Times New Roman" w:hAnsi="Calibri" w:cs="Calibri"/>
-              <w:color w:val="000000"/>
-              <w:sz w:val="24"/>
-            </w:rPr>
-            <w:t xml:space="preserve"> &amp; </w:t>
-          </w:r>
-          <w:proofErr w:type="spellStart"/>
-          <w:r>
-            <w:rPr>
-              <w:rFonts w:ascii="Calibri" w:eastAsia="Times New Roman" w:hAnsi="Calibri" w:cs="Calibri"/>
-              <w:color w:val="000000"/>
-              <w:sz w:val="24"/>
-            </w:rPr>
-            <w:t>Petkov</w:t>
-          </w:r>
-          <w:proofErr w:type="spellEnd"/>
-          <w:r>
-            <w:rPr>
-              <w:rFonts w:ascii="Calibri" w:eastAsia="Times New Roman" w:hAnsi="Calibri" w:cs="Calibri"/>
-              <w:color w:val="000000"/>
-              <w:sz w:val="24"/>
-            </w:rPr>
-            <w:t>, 2026)</w:t>
+            <w:t>(Leushuis &amp; Petkov, 2026)</w:t>
           </w:r>
         </w:sdtContent>
       </w:sdt>
@@ -571,27 +483,7 @@
               <w:sz w:val="24"/>
               <w:szCs w:val="24"/>
             </w:rPr>
-            <w:t>(</w:t>
-          </w:r>
-          <w:proofErr w:type="spellStart"/>
-          <w:r>
-            <w:rPr>
-              <w:rFonts w:ascii="Calibri" w:hAnsi="Calibri" w:cs="Calibri"/>
-              <w:color w:val="000000"/>
-              <w:sz w:val="24"/>
-              <w:szCs w:val="24"/>
-            </w:rPr>
-            <w:t>Khan</w:t>
-          </w:r>
-          <w:proofErr w:type="spellEnd"/>
-          <w:r>
-            <w:rPr>
-              <w:rFonts w:ascii="Calibri" w:hAnsi="Calibri" w:cs="Calibri"/>
-              <w:color w:val="000000"/>
-              <w:sz w:val="24"/>
-              <w:szCs w:val="24"/>
-            </w:rPr>
-            <w:t xml:space="preserve"> et al., 2024)</w:t>
+            <w:t>(Khan et al., 2024)</w:t>
           </w:r>
         </w:sdtContent>
       </w:sdt>
@@ -655,27 +547,7 @@
               <w:sz w:val="24"/>
               <w:szCs w:val="24"/>
             </w:rPr>
-            <w:t>(</w:t>
-          </w:r>
-          <w:proofErr w:type="spellStart"/>
-          <w:r>
-            <w:rPr>
-              <w:rFonts w:ascii="Calibri" w:hAnsi="Calibri" w:cs="Calibri"/>
-              <w:color w:val="000000"/>
-              <w:sz w:val="24"/>
-              <w:szCs w:val="24"/>
-            </w:rPr>
-            <w:t>Vuong</w:t>
-          </w:r>
-          <w:proofErr w:type="spellEnd"/>
-          <w:r>
-            <w:rPr>
-              <w:rFonts w:ascii="Calibri" w:hAnsi="Calibri" w:cs="Calibri"/>
-              <w:color w:val="000000"/>
-              <w:sz w:val="24"/>
-              <w:szCs w:val="24"/>
-            </w:rPr>
-            <w:t xml:space="preserve"> et al., 2022)</w:t>
+            <w:t>(Vuong et al., 2022)</w:t>
           </w:r>
         </w:sdtContent>
       </w:sdt>
@@ -758,27 +630,7 @@
               <w:sz w:val="24"/>
               <w:szCs w:val="24"/>
             </w:rPr>
-            <w:t>(</w:t>
-          </w:r>
-          <w:proofErr w:type="spellStart"/>
-          <w:r>
-            <w:rPr>
-              <w:rFonts w:ascii="Calibri" w:hAnsi="Calibri" w:cs="Calibri"/>
-              <w:color w:val="000000"/>
-              <w:sz w:val="24"/>
-              <w:szCs w:val="24"/>
-            </w:rPr>
-            <w:t>Wang</w:t>
-          </w:r>
-          <w:proofErr w:type="spellEnd"/>
-          <w:r>
-            <w:rPr>
-              <w:rFonts w:ascii="Calibri" w:hAnsi="Calibri" w:cs="Calibri"/>
-              <w:color w:val="000000"/>
-              <w:sz w:val="24"/>
-              <w:szCs w:val="24"/>
-            </w:rPr>
-            <w:t>, 2024)</w:t>
+            <w:t>(Wang, 2024)</w:t>
           </w:r>
         </w:sdtContent>
       </w:sdt>
@@ -1179,27 +1031,7 @@
               <w:sz w:val="24"/>
               <w:szCs w:val="24"/>
             </w:rPr>
-            <w:t>(</w:t>
-          </w:r>
-          <w:proofErr w:type="spellStart"/>
-          <w:r>
-            <w:rPr>
-              <w:rFonts w:ascii="Calibri" w:hAnsi="Calibri" w:cs="Calibri"/>
-              <w:color w:val="000000"/>
-              <w:sz w:val="24"/>
-              <w:szCs w:val="24"/>
-            </w:rPr>
-            <w:t>Branco</w:t>
-          </w:r>
-          <w:proofErr w:type="spellEnd"/>
-          <w:r>
-            <w:rPr>
-              <w:rFonts w:ascii="Calibri" w:hAnsi="Calibri" w:cs="Calibri"/>
-              <w:color w:val="000000"/>
-              <w:sz w:val="24"/>
-              <w:szCs w:val="24"/>
-            </w:rPr>
-            <w:t xml:space="preserve"> et al., 2024)</w:t>
+            <w:t>(Branco et al., 2024)</w:t>
           </w:r>
         </w:sdtContent>
       </w:sdt>
@@ -1221,7 +1053,6 @@
         </w:rPr>
         <w:t xml:space="preserve"> (</w:t>
       </w:r>
-      <w:proofErr w:type="spellStart"/>
       <w:r>
         <w:rPr>
           <w:rFonts w:ascii="Calibri" w:hAnsi="Calibri" w:cs="Calibri"/>
@@ -1231,19 +1062,7 @@
           <w:sz w:val="24"/>
           <w:szCs w:val="24"/>
         </w:rPr>
-        <w:t>Realized</w:t>
-      </w:r>
-      <w:proofErr w:type="spellEnd"/>
-      <w:r>
-        <w:rPr>
-          <w:rFonts w:ascii="Calibri" w:hAnsi="Calibri" w:cs="Calibri"/>
-          <w:i/>
-          <w:iCs/>
-          <w:color w:val="000000"/>
-          <w:sz w:val="24"/>
-          <w:szCs w:val="24"/>
-        </w:rPr>
-        <w:t xml:space="preserve"> Volatility</w:t>
+        <w:t>Realized Volatility</w:t>
       </w:r>
       <w:r>
         <w:rPr>
@@ -2258,21 +2077,12 @@
           <w:szCs w:val="24"/>
         </w:rPr>
       </w:pPr>
-      <w:proofErr w:type="spellStart"/>
-      <w:r>
-        <w:rPr>
-          <w:sz w:val="24"/>
-          <w:szCs w:val="24"/>
-        </w:rPr>
-        <w:t>postpandemické</w:t>
-      </w:r>
-      <w:proofErr w:type="spellEnd"/>
-      <w:r>
-        <w:rPr>
-          <w:sz w:val="24"/>
-          <w:szCs w:val="24"/>
-        </w:rPr>
-        <w:t xml:space="preserve"> obdobie (202</w:t>
+      <w:r>
+        <w:rPr>
+          <w:sz w:val="24"/>
+          <w:szCs w:val="24"/>
+        </w:rPr>
+        <w:t>postpandemické obdobie (202</w:t>
       </w:r>
       <w:r>
         <w:rPr>
@@ -2342,19 +2152,8 @@
           <w:sz w:val="24"/>
           <w:szCs w:val="24"/>
         </w:rPr>
-        <w:t xml:space="preserve">Yahoo </w:t>
-      </w:r>
-      <w:proofErr w:type="spellStart"/>
-      <w:r>
-        <w:rPr>
-          <w:i/>
-          <w:iCs/>
-          <w:sz w:val="24"/>
-          <w:szCs w:val="24"/>
-        </w:rPr>
-        <w:t>Finance</w:t>
-      </w:r>
-      <w:proofErr w:type="spellEnd"/>
+        <w:t>Yahoo Finance</w:t>
+      </w:r>
       <w:r>
         <w:rPr>
           <w:sz w:val="24"/>
@@ -2545,55 +2344,7 @@
           <w:sz w:val="24"/>
           <w:szCs w:val="24"/>
         </w:rPr>
-        <w:t xml:space="preserve"> a následne budú analyzované ich vlastnosti ako </w:t>
-      </w:r>
-      <w:proofErr w:type="spellStart"/>
-      <w:r>
-        <w:rPr>
-          <w:sz w:val="24"/>
-          <w:szCs w:val="24"/>
-        </w:rPr>
-        <w:t>stacionarita</w:t>
-      </w:r>
-      <w:proofErr w:type="spellEnd"/>
-      <w:r>
-        <w:rPr>
-          <w:sz w:val="24"/>
-          <w:szCs w:val="24"/>
-        </w:rPr>
-        <w:t xml:space="preserve">, </w:t>
-      </w:r>
-      <w:proofErr w:type="spellStart"/>
-      <w:r>
-        <w:rPr>
-          <w:sz w:val="24"/>
-          <w:szCs w:val="24"/>
-        </w:rPr>
-        <w:t>autokorelácia</w:t>
-      </w:r>
-      <w:proofErr w:type="spellEnd"/>
-      <w:r>
-        <w:rPr>
-          <w:sz w:val="24"/>
-          <w:szCs w:val="24"/>
-        </w:rPr>
-        <w:t xml:space="preserve"> a </w:t>
-      </w:r>
-      <w:proofErr w:type="spellStart"/>
-      <w:r>
-        <w:rPr>
-          <w:sz w:val="24"/>
-          <w:szCs w:val="24"/>
-        </w:rPr>
-        <w:t>heteroskedasticita</w:t>
-      </w:r>
-      <w:proofErr w:type="spellEnd"/>
-      <w:r>
-        <w:rPr>
-          <w:sz w:val="24"/>
-          <w:szCs w:val="24"/>
-        </w:rPr>
-        <w:t xml:space="preserve">. </w:t>
+        <w:t xml:space="preserve"> a následne budú analyzované ich vlastnosti ako stacionarita, autokorelácia a heteroskedasticita. </w:t>
       </w:r>
       <w:r>
         <w:rPr>
@@ -2755,7 +2506,21 @@
           <w:sz w:val="24"/>
           <w:szCs w:val="24"/>
         </w:rPr>
-        <w:t xml:space="preserve">, ako aj model z rodiny </w:t>
+        <w:t>, ako aj</w:t>
+      </w:r>
+      <w:r>
+        <w:rPr>
+          <w:sz w:val="24"/>
+          <w:szCs w:val="24"/>
+        </w:rPr>
+        <w:t xml:space="preserve"> asymetrický</w:t>
+      </w:r>
+      <w:r>
+        <w:rPr>
+          <w:sz w:val="24"/>
+          <w:szCs w:val="24"/>
+        </w:rPr>
+        <w:t xml:space="preserve"> model z rodiny </w:t>
       </w:r>
       <w:r>
         <w:rPr>
@@ -2773,7 +2538,6 @@
         </w:rPr>
         <w:t xml:space="preserve">. Z metód umelej inteligencie budú použité modely </w:t>
       </w:r>
-      <w:proofErr w:type="spellStart"/>
       <w:r>
         <w:rPr>
           <w:i/>
@@ -2783,7 +2547,6 @@
         </w:rPr>
         <w:t>XGBoost</w:t>
       </w:r>
-      <w:proofErr w:type="spellEnd"/>
       <w:r>
         <w:rPr>
           <w:sz w:val="24"/>
@@ -2873,7 +2636,6 @@
         </w:rPr>
         <w:t xml:space="preserve"> modelov bude realizované pomocou </w:t>
       </w:r>
-      <w:proofErr w:type="spellStart"/>
       <w:r>
         <w:rPr>
           <w:i/>
@@ -2883,7 +2645,6 @@
         </w:rPr>
         <w:t>rolling-window</w:t>
       </w:r>
-      <w:proofErr w:type="spellEnd"/>
       <w:r>
         <w:rPr>
           <w:sz w:val="24"/>
@@ -3035,151 +2796,13 @@
               <w14:ligatures w14:val="none"/>
             </w:rPr>
           </w:pPr>
-          <w:proofErr w:type="spellStart"/>
           <w:r>
             <w:rPr>
               <w:rFonts w:ascii="Calibri" w:eastAsia="Times New Roman" w:hAnsi="Calibri" w:cs="Calibri"/>
               <w:color w:val="000000"/>
             </w:rPr>
-            <w:t>Branco</w:t>
+            <w:t xml:space="preserve">Branco, R. R., Rubesam, A., &amp; Zevallos, M. (2024). Forecasting realized volatility: Does anything beat linear models? </w:t>
           </w:r>
-          <w:proofErr w:type="spellEnd"/>
-          <w:r>
-            <w:rPr>
-              <w:rFonts w:ascii="Calibri" w:eastAsia="Times New Roman" w:hAnsi="Calibri" w:cs="Calibri"/>
-              <w:color w:val="000000"/>
-            </w:rPr>
-            <w:t xml:space="preserve">, R. R., </w:t>
-          </w:r>
-          <w:proofErr w:type="spellStart"/>
-          <w:r>
-            <w:rPr>
-              <w:rFonts w:ascii="Calibri" w:eastAsia="Times New Roman" w:hAnsi="Calibri" w:cs="Calibri"/>
-              <w:color w:val="000000"/>
-            </w:rPr>
-            <w:t>Rubesam</w:t>
-          </w:r>
-          <w:proofErr w:type="spellEnd"/>
-          <w:r>
-            <w:rPr>
-              <w:rFonts w:ascii="Calibri" w:eastAsia="Times New Roman" w:hAnsi="Calibri" w:cs="Calibri"/>
-              <w:color w:val="000000"/>
-            </w:rPr>
-            <w:t xml:space="preserve">, A., &amp; </w:t>
-          </w:r>
-          <w:proofErr w:type="spellStart"/>
-          <w:r>
-            <w:rPr>
-              <w:rFonts w:ascii="Calibri" w:eastAsia="Times New Roman" w:hAnsi="Calibri" w:cs="Calibri"/>
-              <w:color w:val="000000"/>
-            </w:rPr>
-            <w:t>Zevallos</w:t>
-          </w:r>
-          <w:proofErr w:type="spellEnd"/>
-          <w:r>
-            <w:rPr>
-              <w:rFonts w:ascii="Calibri" w:eastAsia="Times New Roman" w:hAnsi="Calibri" w:cs="Calibri"/>
-              <w:color w:val="000000"/>
-            </w:rPr>
-            <w:t xml:space="preserve">, M. (2024). </w:t>
-          </w:r>
-          <w:proofErr w:type="spellStart"/>
-          <w:r>
-            <w:rPr>
-              <w:rFonts w:ascii="Calibri" w:eastAsia="Times New Roman" w:hAnsi="Calibri" w:cs="Calibri"/>
-              <w:color w:val="000000"/>
-            </w:rPr>
-            <w:t>Forecasting</w:t>
-          </w:r>
-          <w:proofErr w:type="spellEnd"/>
-          <w:r>
-            <w:rPr>
-              <w:rFonts w:ascii="Calibri" w:eastAsia="Times New Roman" w:hAnsi="Calibri" w:cs="Calibri"/>
-              <w:color w:val="000000"/>
-            </w:rPr>
-            <w:t xml:space="preserve"> </w:t>
-          </w:r>
-          <w:proofErr w:type="spellStart"/>
-          <w:r>
-            <w:rPr>
-              <w:rFonts w:ascii="Calibri" w:eastAsia="Times New Roman" w:hAnsi="Calibri" w:cs="Calibri"/>
-              <w:color w:val="000000"/>
-            </w:rPr>
-            <w:t>realized</w:t>
-          </w:r>
-          <w:proofErr w:type="spellEnd"/>
-          <w:r>
-            <w:rPr>
-              <w:rFonts w:ascii="Calibri" w:eastAsia="Times New Roman" w:hAnsi="Calibri" w:cs="Calibri"/>
-              <w:color w:val="000000"/>
-            </w:rPr>
-            <w:t xml:space="preserve"> volatility: </w:t>
-          </w:r>
-          <w:proofErr w:type="spellStart"/>
-          <w:r>
-            <w:rPr>
-              <w:rFonts w:ascii="Calibri" w:eastAsia="Times New Roman" w:hAnsi="Calibri" w:cs="Calibri"/>
-              <w:color w:val="000000"/>
-            </w:rPr>
-            <w:t>Does</w:t>
-          </w:r>
-          <w:proofErr w:type="spellEnd"/>
-          <w:r>
-            <w:rPr>
-              <w:rFonts w:ascii="Calibri" w:eastAsia="Times New Roman" w:hAnsi="Calibri" w:cs="Calibri"/>
-              <w:color w:val="000000"/>
-            </w:rPr>
-            <w:t xml:space="preserve"> </w:t>
-          </w:r>
-          <w:proofErr w:type="spellStart"/>
-          <w:r>
-            <w:rPr>
-              <w:rFonts w:ascii="Calibri" w:eastAsia="Times New Roman" w:hAnsi="Calibri" w:cs="Calibri"/>
-              <w:color w:val="000000"/>
-            </w:rPr>
-            <w:t>anything</w:t>
-          </w:r>
-          <w:proofErr w:type="spellEnd"/>
-          <w:r>
-            <w:rPr>
-              <w:rFonts w:ascii="Calibri" w:eastAsia="Times New Roman" w:hAnsi="Calibri" w:cs="Calibri"/>
-              <w:color w:val="000000"/>
-            </w:rPr>
-            <w:t xml:space="preserve"> beat </w:t>
-          </w:r>
-          <w:proofErr w:type="spellStart"/>
-          <w:r>
-            <w:rPr>
-              <w:rFonts w:ascii="Calibri" w:eastAsia="Times New Roman" w:hAnsi="Calibri" w:cs="Calibri"/>
-              <w:color w:val="000000"/>
-            </w:rPr>
-            <w:t>linear</w:t>
-          </w:r>
-          <w:proofErr w:type="spellEnd"/>
-          <w:r>
-            <w:rPr>
-              <w:rFonts w:ascii="Calibri" w:eastAsia="Times New Roman" w:hAnsi="Calibri" w:cs="Calibri"/>
-              <w:color w:val="000000"/>
-            </w:rPr>
-            <w:t xml:space="preserve"> </w:t>
-          </w:r>
-          <w:proofErr w:type="spellStart"/>
-          <w:r>
-            <w:rPr>
-              <w:rFonts w:ascii="Calibri" w:eastAsia="Times New Roman" w:hAnsi="Calibri" w:cs="Calibri"/>
-              <w:color w:val="000000"/>
-            </w:rPr>
-            <w:t>models</w:t>
-          </w:r>
-          <w:proofErr w:type="spellEnd"/>
-          <w:r>
-            <w:rPr>
-              <w:rFonts w:ascii="Calibri" w:eastAsia="Times New Roman" w:hAnsi="Calibri" w:cs="Calibri"/>
-              <w:color w:val="000000"/>
-            </w:rPr>
-            <w:t xml:space="preserve">? </w:t>
-          </w:r>
-          <w:proofErr w:type="spellStart"/>
           <w:r>
             <w:rPr>
               <w:rFonts w:ascii="Calibri" w:eastAsia="Times New Roman" w:hAnsi="Calibri" w:cs="Calibri"/>
@@ -3187,49 +2810,8 @@
               <w:iCs/>
               <w:color w:val="000000"/>
             </w:rPr>
-            <w:t>Journal</w:t>
+            <w:t>Journal of Empirical Finance</w:t>
           </w:r>
-          <w:proofErr w:type="spellEnd"/>
-          <w:r>
-            <w:rPr>
-              <w:rFonts w:ascii="Calibri" w:eastAsia="Times New Roman" w:hAnsi="Calibri" w:cs="Calibri"/>
-              <w:i/>
-              <w:iCs/>
-              <w:color w:val="000000"/>
-            </w:rPr>
-            <w:t xml:space="preserve"> of </w:t>
-          </w:r>
-          <w:proofErr w:type="spellStart"/>
-          <w:r>
-            <w:rPr>
-              <w:rFonts w:ascii="Calibri" w:eastAsia="Times New Roman" w:hAnsi="Calibri" w:cs="Calibri"/>
-              <w:i/>
-              <w:iCs/>
-              <w:color w:val="000000"/>
-            </w:rPr>
-            <w:t>Empirical</w:t>
-          </w:r>
-          <w:proofErr w:type="spellEnd"/>
-          <w:r>
-            <w:rPr>
-              <w:rFonts w:ascii="Calibri" w:eastAsia="Times New Roman" w:hAnsi="Calibri" w:cs="Calibri"/>
-              <w:i/>
-              <w:iCs/>
-              <w:color w:val="000000"/>
-            </w:rPr>
-            <w:t xml:space="preserve"> </w:t>
-          </w:r>
-          <w:proofErr w:type="spellStart"/>
-          <w:r>
-            <w:rPr>
-              <w:rFonts w:ascii="Calibri" w:eastAsia="Times New Roman" w:hAnsi="Calibri" w:cs="Calibri"/>
-              <w:i/>
-              <w:iCs/>
-              <w:color w:val="000000"/>
-            </w:rPr>
-            <w:t>Finance</w:t>
-          </w:r>
-          <w:proofErr w:type="spellEnd"/>
           <w:r>
             <w:rPr>
               <w:rFonts w:ascii="Calibri" w:eastAsia="Times New Roman" w:hAnsi="Calibri" w:cs="Calibri"/>
@@ -3265,261 +2847,12 @@
               <w:color w:val="000000"/>
             </w:rPr>
           </w:pPr>
-          <w:proofErr w:type="spellStart"/>
           <w:r>
             <w:rPr>
               <w:rFonts w:ascii="Calibri" w:eastAsia="Times New Roman" w:hAnsi="Calibri" w:cs="Calibri"/>
               <w:color w:val="000000"/>
             </w:rPr>
-            <w:t>Khan</w:t>
-          </w:r>
-          <w:proofErr w:type="spellEnd"/>
-          <w:r>
-            <w:rPr>
-              <w:rFonts w:ascii="Calibri" w:eastAsia="Times New Roman" w:hAnsi="Calibri" w:cs="Calibri"/>
-              <w:color w:val="000000"/>
-            </w:rPr>
-            <w:t xml:space="preserve">, M. N., </w:t>
-          </w:r>
-          <w:proofErr w:type="spellStart"/>
-          <w:r>
-            <w:rPr>
-              <w:rFonts w:ascii="Calibri" w:eastAsia="Times New Roman" w:hAnsi="Calibri" w:cs="Calibri"/>
-              <w:color w:val="000000"/>
-            </w:rPr>
-            <w:t>Fifield</w:t>
-          </w:r>
-          <w:proofErr w:type="spellEnd"/>
-          <w:r>
-            <w:rPr>
-              <w:rFonts w:ascii="Calibri" w:eastAsia="Times New Roman" w:hAnsi="Calibri" w:cs="Calibri"/>
-              <w:color w:val="000000"/>
-            </w:rPr>
-            <w:t xml:space="preserve">, S. G. M., &amp; </w:t>
-          </w:r>
-          <w:proofErr w:type="spellStart"/>
-          <w:r>
-            <w:rPr>
-              <w:rFonts w:ascii="Calibri" w:eastAsia="Times New Roman" w:hAnsi="Calibri" w:cs="Calibri"/>
-              <w:color w:val="000000"/>
-            </w:rPr>
-            <w:t>Power</w:t>
-          </w:r>
-          <w:proofErr w:type="spellEnd"/>
-          <w:r>
-            <w:rPr>
-              <w:rFonts w:ascii="Calibri" w:eastAsia="Times New Roman" w:hAnsi="Calibri" w:cs="Calibri"/>
-              <w:color w:val="000000"/>
-            </w:rPr>
-            <w:t xml:space="preserve">, D. M. (2024). </w:t>
-          </w:r>
-          <w:proofErr w:type="spellStart"/>
-          <w:r>
-            <w:rPr>
-              <w:rFonts w:ascii="Calibri" w:eastAsia="Times New Roman" w:hAnsi="Calibri" w:cs="Calibri"/>
-              <w:color w:val="000000"/>
-            </w:rPr>
-            <w:t>The</w:t>
-          </w:r>
-          <w:proofErr w:type="spellEnd"/>
-          <w:r>
-            <w:rPr>
-              <w:rFonts w:ascii="Calibri" w:eastAsia="Times New Roman" w:hAnsi="Calibri" w:cs="Calibri"/>
-              <w:color w:val="000000"/>
-            </w:rPr>
-            <w:t xml:space="preserve"> </w:t>
-          </w:r>
-          <w:proofErr w:type="spellStart"/>
-          <w:r>
-            <w:rPr>
-              <w:rFonts w:ascii="Calibri" w:eastAsia="Times New Roman" w:hAnsi="Calibri" w:cs="Calibri"/>
-              <w:color w:val="000000"/>
-            </w:rPr>
-            <w:t>impact</w:t>
-          </w:r>
-          <w:proofErr w:type="spellEnd"/>
-          <w:r>
-            <w:rPr>
-              <w:rFonts w:ascii="Calibri" w:eastAsia="Times New Roman" w:hAnsi="Calibri" w:cs="Calibri"/>
-              <w:color w:val="000000"/>
-            </w:rPr>
-            <w:t xml:space="preserve"> of </w:t>
-          </w:r>
-          <w:proofErr w:type="spellStart"/>
-          <w:r>
-            <w:rPr>
-              <w:rFonts w:ascii="Calibri" w:eastAsia="Times New Roman" w:hAnsi="Calibri" w:cs="Calibri"/>
-              <w:color w:val="000000"/>
-            </w:rPr>
-            <w:t>the</w:t>
-          </w:r>
-          <w:proofErr w:type="spellEnd"/>
-          <w:r>
-            <w:rPr>
-              <w:rFonts w:ascii="Calibri" w:eastAsia="Times New Roman" w:hAnsi="Calibri" w:cs="Calibri"/>
-              <w:color w:val="000000"/>
-            </w:rPr>
-            <w:t xml:space="preserve"> COVID 19 </w:t>
-          </w:r>
-          <w:proofErr w:type="spellStart"/>
-          <w:r>
-            <w:rPr>
-              <w:rFonts w:ascii="Calibri" w:eastAsia="Times New Roman" w:hAnsi="Calibri" w:cs="Calibri"/>
-              <w:color w:val="000000"/>
-            </w:rPr>
-            <w:t>pandemic</w:t>
-          </w:r>
-          <w:proofErr w:type="spellEnd"/>
-          <w:r>
-            <w:rPr>
-              <w:rFonts w:ascii="Calibri" w:eastAsia="Times New Roman" w:hAnsi="Calibri" w:cs="Calibri"/>
-              <w:color w:val="000000"/>
-            </w:rPr>
-            <w:t xml:space="preserve"> on </w:t>
-          </w:r>
-          <w:proofErr w:type="spellStart"/>
-          <w:r>
-            <w:rPr>
-              <w:rFonts w:ascii="Calibri" w:eastAsia="Times New Roman" w:hAnsi="Calibri" w:cs="Calibri"/>
-              <w:color w:val="000000"/>
-            </w:rPr>
-            <w:t>stock</w:t>
-          </w:r>
-          <w:proofErr w:type="spellEnd"/>
-          <w:r>
-            <w:rPr>
-              <w:rFonts w:ascii="Calibri" w:eastAsia="Times New Roman" w:hAnsi="Calibri" w:cs="Calibri"/>
-              <w:color w:val="000000"/>
-            </w:rPr>
-            <w:t xml:space="preserve"> </w:t>
-          </w:r>
-          <w:proofErr w:type="spellStart"/>
-          <w:r>
-            <w:rPr>
-              <w:rFonts w:ascii="Calibri" w:eastAsia="Times New Roman" w:hAnsi="Calibri" w:cs="Calibri"/>
-              <w:color w:val="000000"/>
-            </w:rPr>
-            <w:t>market</w:t>
-          </w:r>
-          <w:proofErr w:type="spellEnd"/>
-          <w:r>
-            <w:rPr>
-              <w:rFonts w:ascii="Calibri" w:eastAsia="Times New Roman" w:hAnsi="Calibri" w:cs="Calibri"/>
-              <w:color w:val="000000"/>
-            </w:rPr>
-            <w:t xml:space="preserve"> volatility: </w:t>
-          </w:r>
-          <w:proofErr w:type="spellStart"/>
-          <w:r>
-            <w:rPr>
-              <w:rFonts w:ascii="Calibri" w:eastAsia="Times New Roman" w:hAnsi="Calibri" w:cs="Calibri"/>
-              <w:color w:val="000000"/>
-            </w:rPr>
-            <w:t>evidence</w:t>
-          </w:r>
-          <w:proofErr w:type="spellEnd"/>
-          <w:r>
-            <w:rPr>
-              <w:rFonts w:ascii="Calibri" w:eastAsia="Times New Roman" w:hAnsi="Calibri" w:cs="Calibri"/>
-              <w:color w:val="000000"/>
-            </w:rPr>
-            <w:t xml:space="preserve"> </w:t>
-          </w:r>
-          <w:proofErr w:type="spellStart"/>
-          <w:r>
-            <w:rPr>
-              <w:rFonts w:ascii="Calibri" w:eastAsia="Times New Roman" w:hAnsi="Calibri" w:cs="Calibri"/>
-              <w:color w:val="000000"/>
-            </w:rPr>
-            <w:t>from</w:t>
-          </w:r>
-          <w:proofErr w:type="spellEnd"/>
-          <w:r>
-            <w:rPr>
-              <w:rFonts w:ascii="Calibri" w:eastAsia="Times New Roman" w:hAnsi="Calibri" w:cs="Calibri"/>
-              <w:color w:val="000000"/>
-            </w:rPr>
-            <w:t xml:space="preserve"> a </w:t>
-          </w:r>
-          <w:proofErr w:type="spellStart"/>
-          <w:r>
-            <w:rPr>
-              <w:rFonts w:ascii="Calibri" w:eastAsia="Times New Roman" w:hAnsi="Calibri" w:cs="Calibri"/>
-              <w:color w:val="000000"/>
-            </w:rPr>
-            <w:t>selection</w:t>
-          </w:r>
-          <w:proofErr w:type="spellEnd"/>
-          <w:r>
-            <w:rPr>
-              <w:rFonts w:ascii="Calibri" w:eastAsia="Times New Roman" w:hAnsi="Calibri" w:cs="Calibri"/>
-              <w:color w:val="000000"/>
-            </w:rPr>
-            <w:t xml:space="preserve"> of </w:t>
-          </w:r>
-          <w:proofErr w:type="spellStart"/>
-          <w:r>
-            <w:rPr>
-              <w:rFonts w:ascii="Calibri" w:eastAsia="Times New Roman" w:hAnsi="Calibri" w:cs="Calibri"/>
-              <w:color w:val="000000"/>
-            </w:rPr>
-            <w:t>developed</w:t>
-          </w:r>
-          <w:proofErr w:type="spellEnd"/>
-          <w:r>
-            <w:rPr>
-              <w:rFonts w:ascii="Calibri" w:eastAsia="Times New Roman" w:hAnsi="Calibri" w:cs="Calibri"/>
-              <w:color w:val="000000"/>
-            </w:rPr>
-            <w:t xml:space="preserve"> and </w:t>
-          </w:r>
-          <w:proofErr w:type="spellStart"/>
-          <w:r>
-            <w:rPr>
-              <w:rFonts w:ascii="Calibri" w:eastAsia="Times New Roman" w:hAnsi="Calibri" w:cs="Calibri"/>
-              <w:color w:val="000000"/>
-            </w:rPr>
-            <w:t>emerging</w:t>
-          </w:r>
-          <w:proofErr w:type="spellEnd"/>
-          <w:r>
-            <w:rPr>
-              <w:rFonts w:ascii="Calibri" w:eastAsia="Times New Roman" w:hAnsi="Calibri" w:cs="Calibri"/>
-              <w:color w:val="000000"/>
-            </w:rPr>
-            <w:t xml:space="preserve"> </w:t>
-          </w:r>
-          <w:proofErr w:type="spellStart"/>
-          <w:r>
-            <w:rPr>
-              <w:rFonts w:ascii="Calibri" w:eastAsia="Times New Roman" w:hAnsi="Calibri" w:cs="Calibri"/>
-              <w:color w:val="000000"/>
-            </w:rPr>
-            <w:t>stock</w:t>
-          </w:r>
-          <w:proofErr w:type="spellEnd"/>
-          <w:r>
-            <w:rPr>
-              <w:rFonts w:ascii="Calibri" w:eastAsia="Times New Roman" w:hAnsi="Calibri" w:cs="Calibri"/>
-              <w:color w:val="000000"/>
-            </w:rPr>
-            <w:t xml:space="preserve"> </w:t>
-          </w:r>
-          <w:proofErr w:type="spellStart"/>
-          <w:r>
-            <w:rPr>
-              <w:rFonts w:ascii="Calibri" w:eastAsia="Times New Roman" w:hAnsi="Calibri" w:cs="Calibri"/>
-              <w:color w:val="000000"/>
-            </w:rPr>
-            <w:t>markets</w:t>
-          </w:r>
-          <w:proofErr w:type="spellEnd"/>
-          <w:r>
-            <w:rPr>
-              <w:rFonts w:ascii="Calibri" w:eastAsia="Times New Roman" w:hAnsi="Calibri" w:cs="Calibri"/>
-              <w:color w:val="000000"/>
-            </w:rPr>
-            <w:t xml:space="preserve">. </w:t>
+            <w:t xml:space="preserve">Khan, M. N., Fifield, S. G. M., &amp; Power, D. M. (2024). The impact of the COVID 19 pandemic on stock market volatility: evidence from a selection of developed and emerging stock markets. </w:t>
           </w:r>
           <w:r>
             <w:rPr>
@@ -3528,27 +2861,7 @@
               <w:iCs/>
               <w:color w:val="000000"/>
             </w:rPr>
-            <w:t xml:space="preserve">SN Business &amp; </w:t>
-          </w:r>
-          <w:proofErr w:type="spellStart"/>
-          <w:r>
-            <w:rPr>
-              <w:rFonts w:ascii="Calibri" w:eastAsia="Times New Roman" w:hAnsi="Calibri" w:cs="Calibri"/>
-              <w:i/>
-              <w:iCs/>
-              <w:color w:val="000000"/>
-            </w:rPr>
-            <w:t>Economics</w:t>
-          </w:r>
-          <w:proofErr w:type="spellEnd"/>
-          <w:r>
-            <w:rPr>
-              <w:rFonts w:ascii="Calibri" w:eastAsia="Times New Roman" w:hAnsi="Calibri" w:cs="Calibri"/>
-              <w:i/>
-              <w:iCs/>
-              <w:color w:val="000000"/>
-            </w:rPr>
-            <w:t xml:space="preserve"> 2024 4:6</w:t>
+            <w:t>SN Business &amp; Economics 2024 4:6</w:t>
           </w:r>
           <w:r>
             <w:rPr>
@@ -3585,23 +2898,13 @@
               <w:color w:val="000000"/>
             </w:rPr>
           </w:pPr>
-          <w:proofErr w:type="spellStart"/>
           <w:r>
             <w:rPr>
               <w:rFonts w:ascii="Calibri" w:eastAsia="Times New Roman" w:hAnsi="Calibri" w:cs="Calibri"/>
               <w:color w:val="000000"/>
             </w:rPr>
-            <w:t>Kılıç</w:t>
+            <w:t xml:space="preserve">Kılıç, R. (2025). </w:t>
           </w:r>
-          <w:proofErr w:type="spellEnd"/>
-          <w:r>
-            <w:rPr>
-              <w:rFonts w:ascii="Calibri" w:eastAsia="Times New Roman" w:hAnsi="Calibri" w:cs="Calibri"/>
-              <w:color w:val="000000"/>
-            </w:rPr>
-            <w:t xml:space="preserve">, R. (2025). </w:t>
-          </w:r>
-          <w:proofErr w:type="spellStart"/>
           <w:r>
             <w:rPr>
               <w:rFonts w:ascii="Calibri" w:eastAsia="Times New Roman" w:hAnsi="Calibri" w:cs="Calibri"/>
@@ -3609,189 +2912,8 @@
               <w:iCs/>
               <w:color w:val="000000"/>
             </w:rPr>
-            <w:t>Linear</w:t>
+            <w:t>Linear and nonlinear econometric models against machine learning models: realized volatility prediction</w:t>
           </w:r>
-          <w:proofErr w:type="spellEnd"/>
-          <w:r>
-            <w:rPr>
-              <w:rFonts w:ascii="Calibri" w:eastAsia="Times New Roman" w:hAnsi="Calibri" w:cs="Calibri"/>
-              <w:i/>
-              <w:iCs/>
-              <w:color w:val="000000"/>
-            </w:rPr>
-            <w:t xml:space="preserve"> and </w:t>
-          </w:r>
-          <w:proofErr w:type="spellStart"/>
-          <w:r>
-            <w:rPr>
-              <w:rFonts w:ascii="Calibri" w:eastAsia="Times New Roman" w:hAnsi="Calibri" w:cs="Calibri"/>
-              <w:i/>
-              <w:iCs/>
-              <w:color w:val="000000"/>
-            </w:rPr>
-            <w:t>nonlinear</w:t>
-          </w:r>
-          <w:proofErr w:type="spellEnd"/>
-          <w:r>
-            <w:rPr>
-              <w:rFonts w:ascii="Calibri" w:eastAsia="Times New Roman" w:hAnsi="Calibri" w:cs="Calibri"/>
-              <w:i/>
-              <w:iCs/>
-              <w:color w:val="000000"/>
-            </w:rPr>
-            <w:t xml:space="preserve"> </w:t>
-          </w:r>
-          <w:proofErr w:type="spellStart"/>
-          <w:r>
-            <w:rPr>
-              <w:rFonts w:ascii="Calibri" w:eastAsia="Times New Roman" w:hAnsi="Calibri" w:cs="Calibri"/>
-              <w:i/>
-              <w:iCs/>
-              <w:color w:val="000000"/>
-            </w:rPr>
-            <w:t>econometric</w:t>
-          </w:r>
-          <w:proofErr w:type="spellEnd"/>
-          <w:r>
-            <w:rPr>
-              <w:rFonts w:ascii="Calibri" w:eastAsia="Times New Roman" w:hAnsi="Calibri" w:cs="Calibri"/>
-              <w:i/>
-              <w:iCs/>
-              <w:color w:val="000000"/>
-            </w:rPr>
-            <w:t xml:space="preserve"> </w:t>
-          </w:r>
-          <w:proofErr w:type="spellStart"/>
-          <w:r>
-            <w:rPr>
-              <w:rFonts w:ascii="Calibri" w:eastAsia="Times New Roman" w:hAnsi="Calibri" w:cs="Calibri"/>
-              <w:i/>
-              <w:iCs/>
-              <w:color w:val="000000"/>
-            </w:rPr>
-            <w:t>models</w:t>
-          </w:r>
-          <w:proofErr w:type="spellEnd"/>
-          <w:r>
-            <w:rPr>
-              <w:rFonts w:ascii="Calibri" w:eastAsia="Times New Roman" w:hAnsi="Calibri" w:cs="Calibri"/>
-              <w:i/>
-              <w:iCs/>
-              <w:color w:val="000000"/>
-            </w:rPr>
-            <w:t xml:space="preserve"> </w:t>
-          </w:r>
-          <w:proofErr w:type="spellStart"/>
-          <w:r>
-            <w:rPr>
-              <w:rFonts w:ascii="Calibri" w:eastAsia="Times New Roman" w:hAnsi="Calibri" w:cs="Calibri"/>
-              <w:i/>
-              <w:iCs/>
-              <w:color w:val="000000"/>
-            </w:rPr>
-            <w:t>against</w:t>
-          </w:r>
-          <w:proofErr w:type="spellEnd"/>
-          <w:r>
-            <w:rPr>
-              <w:rFonts w:ascii="Calibri" w:eastAsia="Times New Roman" w:hAnsi="Calibri" w:cs="Calibri"/>
-              <w:i/>
-              <w:iCs/>
-              <w:color w:val="000000"/>
-            </w:rPr>
-            <w:t xml:space="preserve"> </w:t>
-          </w:r>
-          <w:proofErr w:type="spellStart"/>
-          <w:r>
-            <w:rPr>
-              <w:rFonts w:ascii="Calibri" w:eastAsia="Times New Roman" w:hAnsi="Calibri" w:cs="Calibri"/>
-              <w:i/>
-              <w:iCs/>
-              <w:color w:val="000000"/>
-            </w:rPr>
-            <w:t>machine</w:t>
-          </w:r>
-          <w:proofErr w:type="spellEnd"/>
-          <w:r>
-            <w:rPr>
-              <w:rFonts w:ascii="Calibri" w:eastAsia="Times New Roman" w:hAnsi="Calibri" w:cs="Calibri"/>
-              <w:i/>
-              <w:iCs/>
-              <w:color w:val="000000"/>
-            </w:rPr>
-            <w:t xml:space="preserve"> </w:t>
-          </w:r>
-          <w:proofErr w:type="spellStart"/>
-          <w:r>
-            <w:rPr>
-              <w:rFonts w:ascii="Calibri" w:eastAsia="Times New Roman" w:hAnsi="Calibri" w:cs="Calibri"/>
-              <w:i/>
-              <w:iCs/>
-              <w:color w:val="000000"/>
-            </w:rPr>
-            <w:t>learning</w:t>
-          </w:r>
-          <w:proofErr w:type="spellEnd"/>
-          <w:r>
-            <w:rPr>
-              <w:rFonts w:ascii="Calibri" w:eastAsia="Times New Roman" w:hAnsi="Calibri" w:cs="Calibri"/>
-              <w:i/>
-              <w:iCs/>
-              <w:color w:val="000000"/>
-            </w:rPr>
-            <w:t xml:space="preserve"> </w:t>
-          </w:r>
-          <w:proofErr w:type="spellStart"/>
-          <w:r>
-            <w:rPr>
-              <w:rFonts w:ascii="Calibri" w:eastAsia="Times New Roman" w:hAnsi="Calibri" w:cs="Calibri"/>
-              <w:i/>
-              <w:iCs/>
-              <w:color w:val="000000"/>
-            </w:rPr>
-            <w:t>models</w:t>
-          </w:r>
-          <w:proofErr w:type="spellEnd"/>
-          <w:r>
-            <w:rPr>
-              <w:rFonts w:ascii="Calibri" w:eastAsia="Times New Roman" w:hAnsi="Calibri" w:cs="Calibri"/>
-              <w:i/>
-              <w:iCs/>
-              <w:color w:val="000000"/>
-            </w:rPr>
-            <w:t xml:space="preserve">: </w:t>
-          </w:r>
-          <w:proofErr w:type="spellStart"/>
-          <w:r>
-            <w:rPr>
-              <w:rFonts w:ascii="Calibri" w:eastAsia="Times New Roman" w:hAnsi="Calibri" w:cs="Calibri"/>
-              <w:i/>
-              <w:iCs/>
-              <w:color w:val="000000"/>
-            </w:rPr>
-            <w:t>realized</w:t>
-          </w:r>
-          <w:proofErr w:type="spellEnd"/>
-          <w:r>
-            <w:rPr>
-              <w:rFonts w:ascii="Calibri" w:eastAsia="Times New Roman" w:hAnsi="Calibri" w:cs="Calibri"/>
-              <w:i/>
-              <w:iCs/>
-              <w:color w:val="000000"/>
-            </w:rPr>
-            <w:t xml:space="preserve"> volatility </w:t>
-          </w:r>
-          <w:proofErr w:type="spellStart"/>
-          <w:r>
-            <w:rPr>
-              <w:rFonts w:ascii="Calibri" w:eastAsia="Times New Roman" w:hAnsi="Calibri" w:cs="Calibri"/>
-              <w:i/>
-              <w:iCs/>
-              <w:color w:val="000000"/>
-            </w:rPr>
-            <w:t>prediction</w:t>
-          </w:r>
-          <w:proofErr w:type="spellEnd"/>
           <w:r>
             <w:rPr>
               <w:rFonts w:ascii="Calibri" w:eastAsia="Times New Roman" w:hAnsi="Calibri" w:cs="Calibri"/>
@@ -3811,119 +2933,13 @@
               <w:color w:val="000000"/>
             </w:rPr>
           </w:pPr>
-          <w:proofErr w:type="spellStart"/>
           <w:r>
             <w:rPr>
               <w:rFonts w:ascii="Calibri" w:eastAsia="Times New Roman" w:hAnsi="Calibri" w:cs="Calibri"/>
               <w:color w:val="000000"/>
             </w:rPr>
-            <w:t>Leushuis</w:t>
+            <w:t xml:space="preserve">Leushuis, R. M., &amp; Petkov, N. (2026). Advances in forecasting realized volatility: a review of methodologies. </w:t>
           </w:r>
-          <w:proofErr w:type="spellEnd"/>
-          <w:r>
-            <w:rPr>
-              <w:rFonts w:ascii="Calibri" w:eastAsia="Times New Roman" w:hAnsi="Calibri" w:cs="Calibri"/>
-              <w:color w:val="000000"/>
-            </w:rPr>
-            <w:t xml:space="preserve">, R. M., &amp; </w:t>
-          </w:r>
-          <w:proofErr w:type="spellStart"/>
-          <w:r>
-            <w:rPr>
-              <w:rFonts w:ascii="Calibri" w:eastAsia="Times New Roman" w:hAnsi="Calibri" w:cs="Calibri"/>
-              <w:color w:val="000000"/>
-            </w:rPr>
-            <w:t>Petkov</w:t>
-          </w:r>
-          <w:proofErr w:type="spellEnd"/>
-          <w:r>
-            <w:rPr>
-              <w:rFonts w:ascii="Calibri" w:eastAsia="Times New Roman" w:hAnsi="Calibri" w:cs="Calibri"/>
-              <w:color w:val="000000"/>
-            </w:rPr>
-            <w:t xml:space="preserve">, N. (2026). </w:t>
-          </w:r>
-          <w:proofErr w:type="spellStart"/>
-          <w:r>
-            <w:rPr>
-              <w:rFonts w:ascii="Calibri" w:eastAsia="Times New Roman" w:hAnsi="Calibri" w:cs="Calibri"/>
-              <w:color w:val="000000"/>
-            </w:rPr>
-            <w:t>Advances</w:t>
-          </w:r>
-          <w:proofErr w:type="spellEnd"/>
-          <w:r>
-            <w:rPr>
-              <w:rFonts w:ascii="Calibri" w:eastAsia="Times New Roman" w:hAnsi="Calibri" w:cs="Calibri"/>
-              <w:color w:val="000000"/>
-            </w:rPr>
-            <w:t xml:space="preserve"> in </w:t>
-          </w:r>
-          <w:proofErr w:type="spellStart"/>
-          <w:r>
-            <w:rPr>
-              <w:rFonts w:ascii="Calibri" w:eastAsia="Times New Roman" w:hAnsi="Calibri" w:cs="Calibri"/>
-              <w:color w:val="000000"/>
-            </w:rPr>
-            <w:t>forecasting</w:t>
-          </w:r>
-          <w:proofErr w:type="spellEnd"/>
-          <w:r>
-            <w:rPr>
-              <w:rFonts w:ascii="Calibri" w:eastAsia="Times New Roman" w:hAnsi="Calibri" w:cs="Calibri"/>
-              <w:color w:val="000000"/>
-            </w:rPr>
-            <w:t xml:space="preserve"> </w:t>
-          </w:r>
-          <w:proofErr w:type="spellStart"/>
-          <w:r>
-            <w:rPr>
-              <w:rFonts w:ascii="Calibri" w:eastAsia="Times New Roman" w:hAnsi="Calibri" w:cs="Calibri"/>
-              <w:color w:val="000000"/>
-            </w:rPr>
-            <w:t>realized</w:t>
-          </w:r>
-          <w:proofErr w:type="spellEnd"/>
-          <w:r>
-            <w:rPr>
-              <w:rFonts w:ascii="Calibri" w:eastAsia="Times New Roman" w:hAnsi="Calibri" w:cs="Calibri"/>
-              <w:color w:val="000000"/>
-            </w:rPr>
-            <w:t xml:space="preserve"> volatility: a </w:t>
-          </w:r>
-          <w:proofErr w:type="spellStart"/>
-          <w:r>
-            <w:rPr>
-              <w:rFonts w:ascii="Calibri" w:eastAsia="Times New Roman" w:hAnsi="Calibri" w:cs="Calibri"/>
-              <w:color w:val="000000"/>
-            </w:rPr>
-            <w:t>review</w:t>
-          </w:r>
-          <w:proofErr w:type="spellEnd"/>
-          <w:r>
-            <w:rPr>
-              <w:rFonts w:ascii="Calibri" w:eastAsia="Times New Roman" w:hAnsi="Calibri" w:cs="Calibri"/>
-              <w:color w:val="000000"/>
-            </w:rPr>
-            <w:t xml:space="preserve"> of </w:t>
-          </w:r>
-          <w:proofErr w:type="spellStart"/>
-          <w:r>
-            <w:rPr>
-              <w:rFonts w:ascii="Calibri" w:eastAsia="Times New Roman" w:hAnsi="Calibri" w:cs="Calibri"/>
-              <w:color w:val="000000"/>
-            </w:rPr>
-            <w:t>methodologies</w:t>
-          </w:r>
-          <w:proofErr w:type="spellEnd"/>
-          <w:r>
-            <w:rPr>
-              <w:rFonts w:ascii="Calibri" w:eastAsia="Times New Roman" w:hAnsi="Calibri" w:cs="Calibri"/>
-              <w:color w:val="000000"/>
-            </w:rPr>
-            <w:t xml:space="preserve">. </w:t>
-          </w:r>
-          <w:proofErr w:type="spellStart"/>
           <w:r>
             <w:rPr>
               <w:rFonts w:ascii="Calibri" w:eastAsia="Times New Roman" w:hAnsi="Calibri" w:cs="Calibri"/>
@@ -3931,37 +2947,7 @@
               <w:iCs/>
               <w:color w:val="000000"/>
             </w:rPr>
-            <w:t>Financial</w:t>
-          </w:r>
-          <w:proofErr w:type="spellEnd"/>
-          <w:r>
-            <w:rPr>
-              <w:rFonts w:ascii="Calibri" w:eastAsia="Times New Roman" w:hAnsi="Calibri" w:cs="Calibri"/>
-              <w:i/>
-              <w:iCs/>
-              <w:color w:val="000000"/>
-            </w:rPr>
-            <w:t xml:space="preserve"> </w:t>
-          </w:r>
-          <w:proofErr w:type="spellStart"/>
-          <w:r>
-            <w:rPr>
-              <w:rFonts w:ascii="Calibri" w:eastAsia="Times New Roman" w:hAnsi="Calibri" w:cs="Calibri"/>
-              <w:i/>
-              <w:iCs/>
-              <w:color w:val="000000"/>
-            </w:rPr>
-            <w:t>Innovation</w:t>
-          </w:r>
-          <w:proofErr w:type="spellEnd"/>
-          <w:r>
-            <w:rPr>
-              <w:rFonts w:ascii="Calibri" w:eastAsia="Times New Roman" w:hAnsi="Calibri" w:cs="Calibri"/>
-              <w:i/>
-              <w:iCs/>
-              <w:color w:val="000000"/>
-            </w:rPr>
-            <w:t xml:space="preserve"> 2026 12:1</w:t>
+            <w:t>Financial Innovation 2026 12:1</w:t>
           </w:r>
           <w:r>
             <w:rPr>
@@ -4003,201 +2989,8 @@
               <w:rFonts w:ascii="Calibri" w:eastAsia="Times New Roman" w:hAnsi="Calibri" w:cs="Calibri"/>
               <w:color w:val="000000"/>
             </w:rPr>
-            <w:t xml:space="preserve">Peter, M., </w:t>
+            <w:t xml:space="preserve">Peter, M., Mirau, S., Sinkwembe, E., Kasumo, C., &amp; Guambe, C. (2026). A stacking model integrating GARCH and LSTM with feature interactions for time series volatility prediction. </w:t>
           </w:r>
-          <w:proofErr w:type="spellStart"/>
-          <w:r>
-            <w:rPr>
-              <w:rFonts w:ascii="Calibri" w:eastAsia="Times New Roman" w:hAnsi="Calibri" w:cs="Calibri"/>
-              <w:color w:val="000000"/>
-            </w:rPr>
-            <w:t>Mirau</w:t>
-          </w:r>
-          <w:proofErr w:type="spellEnd"/>
-          <w:r>
-            <w:rPr>
-              <w:rFonts w:ascii="Calibri" w:eastAsia="Times New Roman" w:hAnsi="Calibri" w:cs="Calibri"/>
-              <w:color w:val="000000"/>
-            </w:rPr>
-            <w:t xml:space="preserve">, S., </w:t>
-          </w:r>
-          <w:proofErr w:type="spellStart"/>
-          <w:r>
-            <w:rPr>
-              <w:rFonts w:ascii="Calibri" w:eastAsia="Times New Roman" w:hAnsi="Calibri" w:cs="Calibri"/>
-              <w:color w:val="000000"/>
-            </w:rPr>
-            <w:t>Sinkwembe</w:t>
-          </w:r>
-          <w:proofErr w:type="spellEnd"/>
-          <w:r>
-            <w:rPr>
-              <w:rFonts w:ascii="Calibri" w:eastAsia="Times New Roman" w:hAnsi="Calibri" w:cs="Calibri"/>
-              <w:color w:val="000000"/>
-            </w:rPr>
-            <w:t xml:space="preserve">, E., </w:t>
-          </w:r>
-          <w:proofErr w:type="spellStart"/>
-          <w:r>
-            <w:rPr>
-              <w:rFonts w:ascii="Calibri" w:eastAsia="Times New Roman" w:hAnsi="Calibri" w:cs="Calibri"/>
-              <w:color w:val="000000"/>
-            </w:rPr>
-            <w:t>Kasumo</w:t>
-          </w:r>
-          <w:proofErr w:type="spellEnd"/>
-          <w:r>
-            <w:rPr>
-              <w:rFonts w:ascii="Calibri" w:eastAsia="Times New Roman" w:hAnsi="Calibri" w:cs="Calibri"/>
-              <w:color w:val="000000"/>
-            </w:rPr>
-            <w:t xml:space="preserve">, C., &amp; </w:t>
-          </w:r>
-          <w:proofErr w:type="spellStart"/>
-          <w:r>
-            <w:rPr>
-              <w:rFonts w:ascii="Calibri" w:eastAsia="Times New Roman" w:hAnsi="Calibri" w:cs="Calibri"/>
-              <w:color w:val="000000"/>
-            </w:rPr>
-            <w:t>Guambe</w:t>
-          </w:r>
-          <w:proofErr w:type="spellEnd"/>
-          <w:r>
-            <w:rPr>
-              <w:rFonts w:ascii="Calibri" w:eastAsia="Times New Roman" w:hAnsi="Calibri" w:cs="Calibri"/>
-              <w:color w:val="000000"/>
-            </w:rPr>
-            <w:t xml:space="preserve">, C. (2026). A </w:t>
-          </w:r>
-          <w:proofErr w:type="spellStart"/>
-          <w:r>
-            <w:rPr>
-              <w:rFonts w:ascii="Calibri" w:eastAsia="Times New Roman" w:hAnsi="Calibri" w:cs="Calibri"/>
-              <w:color w:val="000000"/>
-            </w:rPr>
-            <w:t>stacking</w:t>
-          </w:r>
-          <w:proofErr w:type="spellEnd"/>
-          <w:r>
-            <w:rPr>
-              <w:rFonts w:ascii="Calibri" w:eastAsia="Times New Roman" w:hAnsi="Calibri" w:cs="Calibri"/>
-              <w:color w:val="000000"/>
-            </w:rPr>
-            <w:t xml:space="preserve"> model </w:t>
-          </w:r>
-          <w:proofErr w:type="spellStart"/>
-          <w:r>
-            <w:rPr>
-              <w:rFonts w:ascii="Calibri" w:eastAsia="Times New Roman" w:hAnsi="Calibri" w:cs="Calibri"/>
-              <w:color w:val="000000"/>
-            </w:rPr>
-            <w:t>integrating</w:t>
-          </w:r>
-          <w:proofErr w:type="spellEnd"/>
-          <w:r>
-            <w:rPr>
-              <w:rFonts w:ascii="Calibri" w:eastAsia="Times New Roman" w:hAnsi="Calibri" w:cs="Calibri"/>
-              <w:color w:val="000000"/>
-            </w:rPr>
-            <w:t xml:space="preserve"> GARCH and LSTM </w:t>
-          </w:r>
-          <w:proofErr w:type="spellStart"/>
-          <w:r>
-            <w:rPr>
-              <w:rFonts w:ascii="Calibri" w:eastAsia="Times New Roman" w:hAnsi="Calibri" w:cs="Calibri"/>
-              <w:color w:val="000000"/>
-            </w:rPr>
-            <w:t>with</w:t>
-          </w:r>
-          <w:proofErr w:type="spellEnd"/>
-          <w:r>
-            <w:rPr>
-              <w:rFonts w:ascii="Calibri" w:eastAsia="Times New Roman" w:hAnsi="Calibri" w:cs="Calibri"/>
-              <w:color w:val="000000"/>
-            </w:rPr>
-            <w:t xml:space="preserve"> feature </w:t>
-          </w:r>
-          <w:proofErr w:type="spellStart"/>
-          <w:r>
-            <w:rPr>
-              <w:rFonts w:ascii="Calibri" w:eastAsia="Times New Roman" w:hAnsi="Calibri" w:cs="Calibri"/>
-              <w:color w:val="000000"/>
-            </w:rPr>
-            <w:t>interactions</w:t>
-          </w:r>
-          <w:proofErr w:type="spellEnd"/>
-          <w:r>
-            <w:rPr>
-              <w:rFonts w:ascii="Calibri" w:eastAsia="Times New Roman" w:hAnsi="Calibri" w:cs="Calibri"/>
-              <w:color w:val="000000"/>
-            </w:rPr>
-            <w:t xml:space="preserve"> </w:t>
-          </w:r>
-          <w:proofErr w:type="spellStart"/>
-          <w:r>
-            <w:rPr>
-              <w:rFonts w:ascii="Calibri" w:eastAsia="Times New Roman" w:hAnsi="Calibri" w:cs="Calibri"/>
-              <w:color w:val="000000"/>
-            </w:rPr>
-            <w:t>for</w:t>
-          </w:r>
-          <w:proofErr w:type="spellEnd"/>
-          <w:r>
-            <w:rPr>
-              <w:rFonts w:ascii="Calibri" w:eastAsia="Times New Roman" w:hAnsi="Calibri" w:cs="Calibri"/>
-              <w:color w:val="000000"/>
-            </w:rPr>
-            <w:t xml:space="preserve"> </w:t>
-          </w:r>
-          <w:proofErr w:type="spellStart"/>
-          <w:r>
-            <w:rPr>
-              <w:rFonts w:ascii="Calibri" w:eastAsia="Times New Roman" w:hAnsi="Calibri" w:cs="Calibri"/>
-              <w:color w:val="000000"/>
-            </w:rPr>
-            <w:t>time</w:t>
-          </w:r>
-          <w:proofErr w:type="spellEnd"/>
-          <w:r>
-            <w:rPr>
-              <w:rFonts w:ascii="Calibri" w:eastAsia="Times New Roman" w:hAnsi="Calibri" w:cs="Calibri"/>
-              <w:color w:val="000000"/>
-            </w:rPr>
-            <w:t xml:space="preserve"> </w:t>
-          </w:r>
-          <w:proofErr w:type="spellStart"/>
-          <w:r>
-            <w:rPr>
-              <w:rFonts w:ascii="Calibri" w:eastAsia="Times New Roman" w:hAnsi="Calibri" w:cs="Calibri"/>
-              <w:color w:val="000000"/>
-            </w:rPr>
-            <w:t>series</w:t>
-          </w:r>
-          <w:proofErr w:type="spellEnd"/>
-          <w:r>
-            <w:rPr>
-              <w:rFonts w:ascii="Calibri" w:eastAsia="Times New Roman" w:hAnsi="Calibri" w:cs="Calibri"/>
-              <w:color w:val="000000"/>
-            </w:rPr>
-            <w:t xml:space="preserve"> volatility </w:t>
-          </w:r>
-          <w:proofErr w:type="spellStart"/>
-          <w:r>
-            <w:rPr>
-              <w:rFonts w:ascii="Calibri" w:eastAsia="Times New Roman" w:hAnsi="Calibri" w:cs="Calibri"/>
-              <w:color w:val="000000"/>
-            </w:rPr>
-            <w:t>prediction</w:t>
-          </w:r>
-          <w:proofErr w:type="spellEnd"/>
-          <w:r>
-            <w:rPr>
-              <w:rFonts w:ascii="Calibri" w:eastAsia="Times New Roman" w:hAnsi="Calibri" w:cs="Calibri"/>
-              <w:color w:val="000000"/>
-            </w:rPr>
-            <w:t xml:space="preserve">. </w:t>
-          </w:r>
-          <w:proofErr w:type="spellStart"/>
           <w:r>
             <w:rPr>
               <w:rFonts w:ascii="Calibri" w:eastAsia="Times New Roman" w:hAnsi="Calibri" w:cs="Calibri"/>
@@ -4207,7 +3000,6 @@
             </w:rPr>
             <w:t>Array</w:t>
           </w:r>
-          <w:proofErr w:type="spellEnd"/>
           <w:r>
             <w:rPr>
               <w:rFonts w:ascii="Calibri" w:eastAsia="Times New Roman" w:hAnsi="Calibri" w:cs="Calibri"/>
@@ -4243,247 +3035,13 @@
               <w:color w:val="000000"/>
             </w:rPr>
           </w:pPr>
-          <w:proofErr w:type="spellStart"/>
           <w:r>
             <w:rPr>
               <w:rFonts w:ascii="Calibri" w:eastAsia="Times New Roman" w:hAnsi="Calibri" w:cs="Calibri"/>
               <w:color w:val="000000"/>
             </w:rPr>
-            <w:t>Vuong</w:t>
+            <w:t xml:space="preserve">Vuong, G. T. H., Nguyen, M. H., &amp; Huynh, A. N. Q. (2022). Volatility spillovers from the Chinese stock market to the U.S. stock market: The role of the COVID-19 pandemic. </w:t>
           </w:r>
-          <w:proofErr w:type="spellEnd"/>
-          <w:r>
-            <w:rPr>
-              <w:rFonts w:ascii="Calibri" w:eastAsia="Times New Roman" w:hAnsi="Calibri" w:cs="Calibri"/>
-              <w:color w:val="000000"/>
-            </w:rPr>
-            <w:t xml:space="preserve">, G. T. H., </w:t>
-          </w:r>
-          <w:proofErr w:type="spellStart"/>
-          <w:r>
-            <w:rPr>
-              <w:rFonts w:ascii="Calibri" w:eastAsia="Times New Roman" w:hAnsi="Calibri" w:cs="Calibri"/>
-              <w:color w:val="000000"/>
-            </w:rPr>
-            <w:t>Nguyen</w:t>
-          </w:r>
-          <w:proofErr w:type="spellEnd"/>
-          <w:r>
-            <w:rPr>
-              <w:rFonts w:ascii="Calibri" w:eastAsia="Times New Roman" w:hAnsi="Calibri" w:cs="Calibri"/>
-              <w:color w:val="000000"/>
-            </w:rPr>
-            <w:t xml:space="preserve">, M. H., &amp; </w:t>
-          </w:r>
-          <w:proofErr w:type="spellStart"/>
-          <w:r>
-            <w:rPr>
-              <w:rFonts w:ascii="Calibri" w:eastAsia="Times New Roman" w:hAnsi="Calibri" w:cs="Calibri"/>
-              <w:color w:val="000000"/>
-            </w:rPr>
-            <w:t>Huynh</w:t>
-          </w:r>
-          <w:proofErr w:type="spellEnd"/>
-          <w:r>
-            <w:rPr>
-              <w:rFonts w:ascii="Calibri" w:eastAsia="Times New Roman" w:hAnsi="Calibri" w:cs="Calibri"/>
-              <w:color w:val="000000"/>
-            </w:rPr>
-            <w:t xml:space="preserve">, A. N. Q. (2022). Volatility </w:t>
-          </w:r>
-          <w:proofErr w:type="spellStart"/>
-          <w:r>
-            <w:rPr>
-              <w:rFonts w:ascii="Calibri" w:eastAsia="Times New Roman" w:hAnsi="Calibri" w:cs="Calibri"/>
-              <w:color w:val="000000"/>
-            </w:rPr>
-            <w:t>spillovers</w:t>
-          </w:r>
-          <w:proofErr w:type="spellEnd"/>
-          <w:r>
-            <w:rPr>
-              <w:rFonts w:ascii="Calibri" w:eastAsia="Times New Roman" w:hAnsi="Calibri" w:cs="Calibri"/>
-              <w:color w:val="000000"/>
-            </w:rPr>
-            <w:t xml:space="preserve"> </w:t>
-          </w:r>
-          <w:proofErr w:type="spellStart"/>
-          <w:r>
-            <w:rPr>
-              <w:rFonts w:ascii="Calibri" w:eastAsia="Times New Roman" w:hAnsi="Calibri" w:cs="Calibri"/>
-              <w:color w:val="000000"/>
-            </w:rPr>
-            <w:t>from</w:t>
-          </w:r>
-          <w:proofErr w:type="spellEnd"/>
-          <w:r>
-            <w:rPr>
-              <w:rFonts w:ascii="Calibri" w:eastAsia="Times New Roman" w:hAnsi="Calibri" w:cs="Calibri"/>
-              <w:color w:val="000000"/>
-            </w:rPr>
-            <w:t xml:space="preserve"> </w:t>
-          </w:r>
-          <w:proofErr w:type="spellStart"/>
-          <w:r>
-            <w:rPr>
-              <w:rFonts w:ascii="Calibri" w:eastAsia="Times New Roman" w:hAnsi="Calibri" w:cs="Calibri"/>
-              <w:color w:val="000000"/>
-            </w:rPr>
-            <w:t>the</w:t>
-          </w:r>
-          <w:proofErr w:type="spellEnd"/>
-          <w:r>
-            <w:rPr>
-              <w:rFonts w:ascii="Calibri" w:eastAsia="Times New Roman" w:hAnsi="Calibri" w:cs="Calibri"/>
-              <w:color w:val="000000"/>
-            </w:rPr>
-            <w:t xml:space="preserve"> </w:t>
-          </w:r>
-          <w:proofErr w:type="spellStart"/>
-          <w:r>
-            <w:rPr>
-              <w:rFonts w:ascii="Calibri" w:eastAsia="Times New Roman" w:hAnsi="Calibri" w:cs="Calibri"/>
-              <w:color w:val="000000"/>
-            </w:rPr>
-            <w:t>Chinese</w:t>
-          </w:r>
-          <w:proofErr w:type="spellEnd"/>
-          <w:r>
-            <w:rPr>
-              <w:rFonts w:ascii="Calibri" w:eastAsia="Times New Roman" w:hAnsi="Calibri" w:cs="Calibri"/>
-              <w:color w:val="000000"/>
-            </w:rPr>
-            <w:t xml:space="preserve"> </w:t>
-          </w:r>
-          <w:proofErr w:type="spellStart"/>
-          <w:r>
-            <w:rPr>
-              <w:rFonts w:ascii="Calibri" w:eastAsia="Times New Roman" w:hAnsi="Calibri" w:cs="Calibri"/>
-              <w:color w:val="000000"/>
-            </w:rPr>
-            <w:t>stock</w:t>
-          </w:r>
-          <w:proofErr w:type="spellEnd"/>
-          <w:r>
-            <w:rPr>
-              <w:rFonts w:ascii="Calibri" w:eastAsia="Times New Roman" w:hAnsi="Calibri" w:cs="Calibri"/>
-              <w:color w:val="000000"/>
-            </w:rPr>
-            <w:t xml:space="preserve"> </w:t>
-          </w:r>
-          <w:proofErr w:type="spellStart"/>
-          <w:r>
-            <w:rPr>
-              <w:rFonts w:ascii="Calibri" w:eastAsia="Times New Roman" w:hAnsi="Calibri" w:cs="Calibri"/>
-              <w:color w:val="000000"/>
-            </w:rPr>
-            <w:t>market</w:t>
-          </w:r>
-          <w:proofErr w:type="spellEnd"/>
-          <w:r>
-            <w:rPr>
-              <w:rFonts w:ascii="Calibri" w:eastAsia="Times New Roman" w:hAnsi="Calibri" w:cs="Calibri"/>
-              <w:color w:val="000000"/>
-            </w:rPr>
-            <w:t xml:space="preserve"> to </w:t>
-          </w:r>
-          <w:proofErr w:type="spellStart"/>
-          <w:r>
-            <w:rPr>
-              <w:rFonts w:ascii="Calibri" w:eastAsia="Times New Roman" w:hAnsi="Calibri" w:cs="Calibri"/>
-              <w:color w:val="000000"/>
-            </w:rPr>
-            <w:t>the</w:t>
-          </w:r>
-          <w:proofErr w:type="spellEnd"/>
-          <w:r>
-            <w:rPr>
-              <w:rFonts w:ascii="Calibri" w:eastAsia="Times New Roman" w:hAnsi="Calibri" w:cs="Calibri"/>
-              <w:color w:val="000000"/>
-            </w:rPr>
-            <w:t xml:space="preserve"> U.S. </w:t>
-          </w:r>
-          <w:proofErr w:type="spellStart"/>
-          <w:r>
-            <w:rPr>
-              <w:rFonts w:ascii="Calibri" w:eastAsia="Times New Roman" w:hAnsi="Calibri" w:cs="Calibri"/>
-              <w:color w:val="000000"/>
-            </w:rPr>
-            <w:t>stock</w:t>
-          </w:r>
-          <w:proofErr w:type="spellEnd"/>
-          <w:r>
-            <w:rPr>
-              <w:rFonts w:ascii="Calibri" w:eastAsia="Times New Roman" w:hAnsi="Calibri" w:cs="Calibri"/>
-              <w:color w:val="000000"/>
-            </w:rPr>
-            <w:t xml:space="preserve"> </w:t>
-          </w:r>
-          <w:proofErr w:type="spellStart"/>
-          <w:r>
-            <w:rPr>
-              <w:rFonts w:ascii="Calibri" w:eastAsia="Times New Roman" w:hAnsi="Calibri" w:cs="Calibri"/>
-              <w:color w:val="000000"/>
-            </w:rPr>
-            <w:t>market</w:t>
-          </w:r>
-          <w:proofErr w:type="spellEnd"/>
-          <w:r>
-            <w:rPr>
-              <w:rFonts w:ascii="Calibri" w:eastAsia="Times New Roman" w:hAnsi="Calibri" w:cs="Calibri"/>
-              <w:color w:val="000000"/>
-            </w:rPr>
-            <w:t xml:space="preserve">: </w:t>
-          </w:r>
-          <w:proofErr w:type="spellStart"/>
-          <w:r>
-            <w:rPr>
-              <w:rFonts w:ascii="Calibri" w:eastAsia="Times New Roman" w:hAnsi="Calibri" w:cs="Calibri"/>
-              <w:color w:val="000000"/>
-            </w:rPr>
-            <w:t>The</w:t>
-          </w:r>
-          <w:proofErr w:type="spellEnd"/>
-          <w:r>
-            <w:rPr>
-              <w:rFonts w:ascii="Calibri" w:eastAsia="Times New Roman" w:hAnsi="Calibri" w:cs="Calibri"/>
-              <w:color w:val="000000"/>
-            </w:rPr>
-            <w:t xml:space="preserve"> role of </w:t>
-          </w:r>
-          <w:proofErr w:type="spellStart"/>
-          <w:r>
-            <w:rPr>
-              <w:rFonts w:ascii="Calibri" w:eastAsia="Times New Roman" w:hAnsi="Calibri" w:cs="Calibri"/>
-              <w:color w:val="000000"/>
-            </w:rPr>
-            <w:t>the</w:t>
-          </w:r>
-          <w:proofErr w:type="spellEnd"/>
-          <w:r>
-            <w:rPr>
-              <w:rFonts w:ascii="Calibri" w:eastAsia="Times New Roman" w:hAnsi="Calibri" w:cs="Calibri"/>
-              <w:color w:val="000000"/>
-            </w:rPr>
-            <w:t xml:space="preserve"> COVID-19 </w:t>
-          </w:r>
-          <w:proofErr w:type="spellStart"/>
-          <w:r>
-            <w:rPr>
-              <w:rFonts w:ascii="Calibri" w:eastAsia="Times New Roman" w:hAnsi="Calibri" w:cs="Calibri"/>
-              <w:color w:val="000000"/>
-            </w:rPr>
-            <w:t>pandemic</w:t>
-          </w:r>
-          <w:proofErr w:type="spellEnd"/>
-          <w:r>
-            <w:rPr>
-              <w:rFonts w:ascii="Calibri" w:eastAsia="Times New Roman" w:hAnsi="Calibri" w:cs="Calibri"/>
-              <w:color w:val="000000"/>
-            </w:rPr>
-            <w:t xml:space="preserve">. </w:t>
-          </w:r>
-          <w:proofErr w:type="spellStart"/>
           <w:r>
             <w:rPr>
               <w:rFonts w:ascii="Calibri" w:eastAsia="Times New Roman" w:hAnsi="Calibri" w:cs="Calibri"/>
@@ -4491,69 +3049,8 @@
               <w:iCs/>
               <w:color w:val="000000"/>
             </w:rPr>
-            <w:t>The</w:t>
+            <w:t>The Journal of Economic Asymmetries</w:t>
           </w:r>
-          <w:proofErr w:type="spellEnd"/>
-          <w:r>
-            <w:rPr>
-              <w:rFonts w:ascii="Calibri" w:eastAsia="Times New Roman" w:hAnsi="Calibri" w:cs="Calibri"/>
-              <w:i/>
-              <w:iCs/>
-              <w:color w:val="000000"/>
-            </w:rPr>
-            <w:t xml:space="preserve"> </w:t>
-          </w:r>
-          <w:proofErr w:type="spellStart"/>
-          <w:r>
-            <w:rPr>
-              <w:rFonts w:ascii="Calibri" w:eastAsia="Times New Roman" w:hAnsi="Calibri" w:cs="Calibri"/>
-              <w:i/>
-              <w:iCs/>
-              <w:color w:val="000000"/>
-            </w:rPr>
-            <w:t>Journal</w:t>
-          </w:r>
-          <w:proofErr w:type="spellEnd"/>
-          <w:r>
-            <w:rPr>
-              <w:rFonts w:ascii="Calibri" w:eastAsia="Times New Roman" w:hAnsi="Calibri" w:cs="Calibri"/>
-              <w:i/>
-              <w:iCs/>
-              <w:color w:val="000000"/>
-            </w:rPr>
-            <w:t xml:space="preserve"> of </w:t>
-          </w:r>
-          <w:proofErr w:type="spellStart"/>
-          <w:r>
-            <w:rPr>
-              <w:rFonts w:ascii="Calibri" w:eastAsia="Times New Roman" w:hAnsi="Calibri" w:cs="Calibri"/>
-              <w:i/>
-              <w:iCs/>
-              <w:color w:val="000000"/>
-            </w:rPr>
-            <w:t>Economic</w:t>
-          </w:r>
-          <w:proofErr w:type="spellEnd"/>
-          <w:r>
-            <w:rPr>
-              <w:rFonts w:ascii="Calibri" w:eastAsia="Times New Roman" w:hAnsi="Calibri" w:cs="Calibri"/>
-              <w:i/>
-              <w:iCs/>
-              <w:color w:val="000000"/>
-            </w:rPr>
-            <w:t xml:space="preserve"> </w:t>
-          </w:r>
-          <w:proofErr w:type="spellStart"/>
-          <w:r>
-            <w:rPr>
-              <w:rFonts w:ascii="Calibri" w:eastAsia="Times New Roman" w:hAnsi="Calibri" w:cs="Calibri"/>
-              <w:i/>
-              <w:iCs/>
-              <w:color w:val="000000"/>
-            </w:rPr>
-            <w:t>Asymmetries</w:t>
-          </w:r>
-          <w:proofErr w:type="spellEnd"/>
           <w:r>
             <w:rPr>
               <w:rFonts w:ascii="Calibri" w:eastAsia="Times New Roman" w:hAnsi="Calibri" w:cs="Calibri"/>
@@ -4589,119 +3086,13 @@
               <w:color w:val="000000"/>
             </w:rPr>
           </w:pPr>
-          <w:proofErr w:type="spellStart"/>
           <w:r>
             <w:rPr>
               <w:rFonts w:ascii="Calibri" w:eastAsia="Times New Roman" w:hAnsi="Calibri" w:cs="Calibri"/>
               <w:color w:val="000000"/>
             </w:rPr>
-            <w:t>Wang</w:t>
+            <w:t xml:space="preserve">Wang, Y. (2024). The Relationship Between Geopolitical Risks and Stock Market Volatility. </w:t>
           </w:r>
-          <w:proofErr w:type="spellEnd"/>
-          <w:r>
-            <w:rPr>
-              <w:rFonts w:ascii="Calibri" w:eastAsia="Times New Roman" w:hAnsi="Calibri" w:cs="Calibri"/>
-              <w:color w:val="000000"/>
-            </w:rPr>
-            <w:t xml:space="preserve">, Y. (2024). </w:t>
-          </w:r>
-          <w:proofErr w:type="spellStart"/>
-          <w:r>
-            <w:rPr>
-              <w:rFonts w:ascii="Calibri" w:eastAsia="Times New Roman" w:hAnsi="Calibri" w:cs="Calibri"/>
-              <w:color w:val="000000"/>
-            </w:rPr>
-            <w:t>The</w:t>
-          </w:r>
-          <w:proofErr w:type="spellEnd"/>
-          <w:r>
-            <w:rPr>
-              <w:rFonts w:ascii="Calibri" w:eastAsia="Times New Roman" w:hAnsi="Calibri" w:cs="Calibri"/>
-              <w:color w:val="000000"/>
-            </w:rPr>
-            <w:t xml:space="preserve"> </w:t>
-          </w:r>
-          <w:proofErr w:type="spellStart"/>
-          <w:r>
-            <w:rPr>
-              <w:rFonts w:ascii="Calibri" w:eastAsia="Times New Roman" w:hAnsi="Calibri" w:cs="Calibri"/>
-              <w:color w:val="000000"/>
-            </w:rPr>
-            <w:t>Relationship</w:t>
-          </w:r>
-          <w:proofErr w:type="spellEnd"/>
-          <w:r>
-            <w:rPr>
-              <w:rFonts w:ascii="Calibri" w:eastAsia="Times New Roman" w:hAnsi="Calibri" w:cs="Calibri"/>
-              <w:color w:val="000000"/>
-            </w:rPr>
-            <w:t xml:space="preserve"> </w:t>
-          </w:r>
-          <w:proofErr w:type="spellStart"/>
-          <w:r>
-            <w:rPr>
-              <w:rFonts w:ascii="Calibri" w:eastAsia="Times New Roman" w:hAnsi="Calibri" w:cs="Calibri"/>
-              <w:color w:val="000000"/>
-            </w:rPr>
-            <w:t>Between</w:t>
-          </w:r>
-          <w:proofErr w:type="spellEnd"/>
-          <w:r>
-            <w:rPr>
-              <w:rFonts w:ascii="Calibri" w:eastAsia="Times New Roman" w:hAnsi="Calibri" w:cs="Calibri"/>
-              <w:color w:val="000000"/>
-            </w:rPr>
-            <w:t xml:space="preserve"> </w:t>
-          </w:r>
-          <w:proofErr w:type="spellStart"/>
-          <w:r>
-            <w:rPr>
-              <w:rFonts w:ascii="Calibri" w:eastAsia="Times New Roman" w:hAnsi="Calibri" w:cs="Calibri"/>
-              <w:color w:val="000000"/>
-            </w:rPr>
-            <w:t>Geopolitical</w:t>
-          </w:r>
-          <w:proofErr w:type="spellEnd"/>
-          <w:r>
-            <w:rPr>
-              <w:rFonts w:ascii="Calibri" w:eastAsia="Times New Roman" w:hAnsi="Calibri" w:cs="Calibri"/>
-              <w:color w:val="000000"/>
-            </w:rPr>
-            <w:t xml:space="preserve"> </w:t>
-          </w:r>
-          <w:proofErr w:type="spellStart"/>
-          <w:r>
-            <w:rPr>
-              <w:rFonts w:ascii="Calibri" w:eastAsia="Times New Roman" w:hAnsi="Calibri" w:cs="Calibri"/>
-              <w:color w:val="000000"/>
-            </w:rPr>
-            <w:t>Risks</w:t>
-          </w:r>
-          <w:proofErr w:type="spellEnd"/>
-          <w:r>
-            <w:rPr>
-              <w:rFonts w:ascii="Calibri" w:eastAsia="Times New Roman" w:hAnsi="Calibri" w:cs="Calibri"/>
-              <w:color w:val="000000"/>
-            </w:rPr>
-            <w:t xml:space="preserve"> and Stock </w:t>
-          </w:r>
-          <w:proofErr w:type="spellStart"/>
-          <w:r>
-            <w:rPr>
-              <w:rFonts w:ascii="Calibri" w:eastAsia="Times New Roman" w:hAnsi="Calibri" w:cs="Calibri"/>
-              <w:color w:val="000000"/>
-            </w:rPr>
-            <w:t>Market</w:t>
-          </w:r>
-          <w:proofErr w:type="spellEnd"/>
-          <w:r>
-            <w:rPr>
-              <w:rFonts w:ascii="Calibri" w:eastAsia="Times New Roman" w:hAnsi="Calibri" w:cs="Calibri"/>
-              <w:color w:val="000000"/>
-            </w:rPr>
-            <w:t xml:space="preserve"> Volatility. </w:t>
-          </w:r>
-          <w:proofErr w:type="spellStart"/>
           <w:r>
             <w:rPr>
               <w:rFonts w:ascii="Calibri" w:eastAsia="Times New Roman" w:hAnsi="Calibri" w:cs="Calibri"/>
@@ -4709,37 +3100,7 @@
               <w:iCs/>
               <w:color w:val="000000"/>
             </w:rPr>
-            <w:t>Frontiers</w:t>
-          </w:r>
-          <w:proofErr w:type="spellEnd"/>
-          <w:r>
-            <w:rPr>
-              <w:rFonts w:ascii="Calibri" w:eastAsia="Times New Roman" w:hAnsi="Calibri" w:cs="Calibri"/>
-              <w:i/>
-              <w:iCs/>
-              <w:color w:val="000000"/>
-            </w:rPr>
-            <w:t xml:space="preserve"> in Business, </w:t>
-          </w:r>
-          <w:proofErr w:type="spellStart"/>
-          <w:r>
-            <w:rPr>
-              <w:rFonts w:ascii="Calibri" w:eastAsia="Times New Roman" w:hAnsi="Calibri" w:cs="Calibri"/>
-              <w:i/>
-              <w:iCs/>
-              <w:color w:val="000000"/>
-            </w:rPr>
-            <w:t>Economics</w:t>
-          </w:r>
-          <w:proofErr w:type="spellEnd"/>
-          <w:r>
-            <w:rPr>
-              <w:rFonts w:ascii="Calibri" w:eastAsia="Times New Roman" w:hAnsi="Calibri" w:cs="Calibri"/>
-              <w:i/>
-              <w:iCs/>
-              <w:color w:val="000000"/>
-            </w:rPr>
-            <w:t xml:space="preserve"> and Management</w:t>
+            <w:t>Frontiers in Business, Economics and Management</w:t>
           </w:r>
           <w:r>
             <w:rPr>
@@ -6122,10 +4483,12 @@
   <w:rsids>
     <w:rsidRoot w:val="00EF1F3F"/>
     <w:rsid w:val="00046425"/>
+    <w:rsid w:val="0005623E"/>
     <w:rsid w:val="00150A58"/>
     <w:rsid w:val="001A57E4"/>
     <w:rsid w:val="004C6F8F"/>
     <w:rsid w:val="005425B6"/>
+    <w:rsid w:val="00556436"/>
     <w:rsid w:val="005E5AC4"/>
     <w:rsid w:val="006F40EE"/>
     <w:rsid w:val="00723C5C"/>

</xml_diff>